<commit_message>
Avancée du travail en réseau, exercice 13
</commit_message>
<xml_diff>
--- a/RESEAU_LOCAL_ET_SECURITE/Cours13-CLI_SSH/420-2C5-JR_13_Exercice.docx
+++ b/RESEAU_LOCAL_ET_SECURITE/Cours13-CLI_SSH/420-2C5-JR_13_Exercice.docx
@@ -269,6 +269,49 @@
     <w:p>
       <w:pPr>
         <w:pStyle w:val="Paragraphedeliste"/>
+        <w:spacing w:before="0" w:after="160" w:line="259" w:lineRule="auto"/>
+      </w:pPr>
+      <w:r>
+        <w:drawing>
+          <wp:inline distT="0" distB="0" distL="0" distR="0" wp14:anchorId="56D93FC4" wp14:editId="677037C3">
+            <wp:extent cx="4077269" cy="257211"/>
+            <wp:effectExtent l="0" t="0" r="0" b="9525"/>
+            <wp:docPr id="866257524" name="Image 1"/>
+            <wp:cNvGraphicFramePr>
+              <a:graphicFrameLocks xmlns:a="http://schemas.openxmlformats.org/drawingml/2006/main" noChangeAspect="1"/>
+            </wp:cNvGraphicFramePr>
+            <a:graphic xmlns:a="http://schemas.openxmlformats.org/drawingml/2006/main">
+              <a:graphicData uri="http://schemas.openxmlformats.org/drawingml/2006/picture">
+                <pic:pic xmlns:pic="http://schemas.openxmlformats.org/drawingml/2006/picture">
+                  <pic:nvPicPr>
+                    <pic:cNvPr id="866257524" name=""/>
+                    <pic:cNvPicPr/>
+                  </pic:nvPicPr>
+                  <pic:blipFill>
+                    <a:blip r:embed="rId11"/>
+                    <a:stretch>
+                      <a:fillRect/>
+                    </a:stretch>
+                  </pic:blipFill>
+                  <pic:spPr>
+                    <a:xfrm>
+                      <a:off x="0" y="0"/>
+                      <a:ext cx="4077269" cy="257211"/>
+                    </a:xfrm>
+                    <a:prstGeom prst="rect">
+                      <a:avLst/>
+                    </a:prstGeom>
+                  </pic:spPr>
+                </pic:pic>
+              </a:graphicData>
+            </a:graphic>
+          </wp:inline>
+        </w:drawing>
+      </w:r>
+    </w:p>
+    <w:p>
+      <w:pPr>
+        <w:pStyle w:val="Paragraphedeliste"/>
         <w:numPr>
           <w:ilvl w:val="0"/>
           <w:numId w:val="38"/>
@@ -303,11 +346,85 @@
     <w:p>
       <w:pPr>
         <w:pStyle w:val="Paragraphedeliste"/>
+        <w:spacing w:before="0" w:after="160" w:line="259" w:lineRule="auto"/>
+      </w:pPr>
+      <w:r>
+        <w:drawing>
+          <wp:inline distT="0" distB="0" distL="0" distR="0" wp14:anchorId="634830D2" wp14:editId="6385E0B2">
+            <wp:extent cx="5839640" cy="571580"/>
+            <wp:effectExtent l="0" t="0" r="0" b="0"/>
+            <wp:docPr id="465447667" name="Image 1"/>
+            <wp:cNvGraphicFramePr>
+              <a:graphicFrameLocks xmlns:a="http://schemas.openxmlformats.org/drawingml/2006/main" noChangeAspect="1"/>
+            </wp:cNvGraphicFramePr>
+            <a:graphic xmlns:a="http://schemas.openxmlformats.org/drawingml/2006/main">
+              <a:graphicData uri="http://schemas.openxmlformats.org/drawingml/2006/picture">
+                <pic:pic xmlns:pic="http://schemas.openxmlformats.org/drawingml/2006/picture">
+                  <pic:nvPicPr>
+                    <pic:cNvPr id="465447667" name=""/>
+                    <pic:cNvPicPr/>
+                  </pic:nvPicPr>
+                  <pic:blipFill>
+                    <a:blip r:embed="rId12"/>
+                    <a:stretch>
+                      <a:fillRect/>
+                    </a:stretch>
+                  </pic:blipFill>
+                  <pic:spPr>
+                    <a:xfrm>
+                      <a:off x="0" y="0"/>
+                      <a:ext cx="5839640" cy="571580"/>
+                    </a:xfrm>
+                    <a:prstGeom prst="rect">
+                      <a:avLst/>
+                    </a:prstGeom>
+                  </pic:spPr>
+                </pic:pic>
+              </a:graphicData>
+            </a:graphic>
+          </wp:inline>
+        </w:drawing>
+      </w:r>
+    </w:p>
+    <w:p>
+      <w:pPr>
+        <w:pStyle w:val="Paragraphedeliste"/>
         <w:numPr>
           <w:ilvl w:val="0"/>
           <w:numId w:val="38"/>
         </w:numPr>
         <w:spacing w:before="0" w:after="160" w:line="259" w:lineRule="auto"/>
+      </w:pPr>
+      <w:r>
+        <w:t>Désactiver tous les ports</w:t>
+      </w:r>
+      <w:r>
+        <w:t xml:space="preserve"> </w:t>
+      </w:r>
+      <w:r>
+        <w:rPr>
+          <w:rStyle w:val="CodeCar"/>
+          <w:iCs/>
+        </w:rPr>
+        <w:t>FastEthernet</w:t>
+      </w:r>
+      <w:r>
+        <w:t xml:space="preserve"> </w:t>
+      </w:r>
+      <w:r>
+        <w:t>en même temps</w:t>
+      </w:r>
+      <w:r>
+        <w:t xml:space="preserve"> </w:t>
+      </w:r>
+      <w:r>
+        <w:t>(1 seule commande)</w:t>
+      </w:r>
+    </w:p>
+    <w:p>
+      <w:pPr>
+        <w:pStyle w:val="Paragraphedeliste"/>
+        <w:spacing w:before="0" w:after="160" w:line="259" w:lineRule="auto"/>
         <w:rPr>
           <w:rStyle w:val="CodeChar"/>
           <w:rFonts w:asciiTheme="minorHAnsi" w:eastAsiaTheme="minorEastAsia" w:hAnsiTheme="minorHAnsi" w:cstheme="minorBidi"/>
@@ -316,29 +433,47 @@
         </w:rPr>
       </w:pPr>
       <w:r>
-        <w:t>Désactiver tous les ports</w:t>
-      </w:r>
-      <w:r>
-        <w:t xml:space="preserve"> </w:t>
-      </w:r>
-      <w:r>
-        <w:rPr>
-          <w:rStyle w:val="CodeCar"/>
-          <w:iCs/>
-        </w:rPr>
-        <w:t>FastEthernet</w:t>
-      </w:r>
-      <w:r>
-        <w:t xml:space="preserve"> </w:t>
-      </w:r>
-      <w:r>
-        <w:t>en même temps</w:t>
-      </w:r>
-      <w:r>
-        <w:t xml:space="preserve"> </w:t>
-      </w:r>
-      <w:r>
-        <w:t>(1 seule commande)</w:t>
+        <w:rPr>
+          <w:rStyle w:val="CodeChar"/>
+          <w:rFonts w:asciiTheme="minorHAnsi" w:eastAsiaTheme="minorEastAsia" w:hAnsiTheme="minorHAnsi" w:cstheme="minorBidi"/>
+          <w:iCs w:val="0"/>
+          <w:noProof w:val="0"/>
+        </w:rPr>
+        <w:drawing>
+          <wp:inline distT="0" distB="0" distL="0" distR="0" wp14:anchorId="738977F5" wp14:editId="0517E37B">
+            <wp:extent cx="5943600" cy="444500"/>
+            <wp:effectExtent l="0" t="0" r="0" b="0"/>
+            <wp:docPr id="1040509709" name="Image 1"/>
+            <wp:cNvGraphicFramePr>
+              <a:graphicFrameLocks xmlns:a="http://schemas.openxmlformats.org/drawingml/2006/main" noChangeAspect="1"/>
+            </wp:cNvGraphicFramePr>
+            <a:graphic xmlns:a="http://schemas.openxmlformats.org/drawingml/2006/main">
+              <a:graphicData uri="http://schemas.openxmlformats.org/drawingml/2006/picture">
+                <pic:pic xmlns:pic="http://schemas.openxmlformats.org/drawingml/2006/picture">
+                  <pic:nvPicPr>
+                    <pic:cNvPr id="1040509709" name=""/>
+                    <pic:cNvPicPr/>
+                  </pic:nvPicPr>
+                  <pic:blipFill>
+                    <a:blip r:embed="rId13"/>
+                    <a:stretch>
+                      <a:fillRect/>
+                    </a:stretch>
+                  </pic:blipFill>
+                  <pic:spPr>
+                    <a:xfrm>
+                      <a:off x="0" y="0"/>
+                      <a:ext cx="5943600" cy="444500"/>
+                    </a:xfrm>
+                    <a:prstGeom prst="rect">
+                      <a:avLst/>
+                    </a:prstGeom>
+                  </pic:spPr>
+                </pic:pic>
+              </a:graphicData>
+            </a:graphic>
+          </wp:inline>
+        </w:drawing>
       </w:r>
     </w:p>
     <w:p>
@@ -375,6 +510,49 @@
     <w:p>
       <w:pPr>
         <w:pStyle w:val="Paragraphedeliste"/>
+        <w:spacing w:before="0" w:after="160" w:line="259" w:lineRule="auto"/>
+      </w:pPr>
+      <w:r>
+        <w:drawing>
+          <wp:inline distT="0" distB="0" distL="0" distR="0" wp14:anchorId="56A821A8" wp14:editId="0B201D0D">
+            <wp:extent cx="3781953" cy="209579"/>
+            <wp:effectExtent l="0" t="0" r="9525" b="0"/>
+            <wp:docPr id="1215772681" name="Image 1"/>
+            <wp:cNvGraphicFramePr>
+              <a:graphicFrameLocks xmlns:a="http://schemas.openxmlformats.org/drawingml/2006/main" noChangeAspect="1"/>
+            </wp:cNvGraphicFramePr>
+            <a:graphic xmlns:a="http://schemas.openxmlformats.org/drawingml/2006/main">
+              <a:graphicData uri="http://schemas.openxmlformats.org/drawingml/2006/picture">
+                <pic:pic xmlns:pic="http://schemas.openxmlformats.org/drawingml/2006/picture">
+                  <pic:nvPicPr>
+                    <pic:cNvPr id="1215772681" name=""/>
+                    <pic:cNvPicPr/>
+                  </pic:nvPicPr>
+                  <pic:blipFill>
+                    <a:blip r:embed="rId14"/>
+                    <a:stretch>
+                      <a:fillRect/>
+                    </a:stretch>
+                  </pic:blipFill>
+                  <pic:spPr>
+                    <a:xfrm>
+                      <a:off x="0" y="0"/>
+                      <a:ext cx="3781953" cy="209579"/>
+                    </a:xfrm>
+                    <a:prstGeom prst="rect">
+                      <a:avLst/>
+                    </a:prstGeom>
+                  </pic:spPr>
+                </pic:pic>
+              </a:graphicData>
+            </a:graphic>
+          </wp:inline>
+        </w:drawing>
+      </w:r>
+    </w:p>
+    <w:p>
+      <w:pPr>
+        <w:pStyle w:val="Paragraphedeliste"/>
         <w:numPr>
           <w:ilvl w:val="0"/>
           <w:numId w:val="38"/>
@@ -391,6 +569,49 @@
     <w:p>
       <w:pPr>
         <w:pStyle w:val="Paragraphedeliste"/>
+        <w:spacing w:before="0" w:after="160" w:line="259" w:lineRule="auto"/>
+      </w:pPr>
+      <w:r>
+        <w:drawing>
+          <wp:inline distT="0" distB="0" distL="0" distR="0" wp14:anchorId="7E22E0C3" wp14:editId="1B158DF5">
+            <wp:extent cx="1848108" cy="238158"/>
+            <wp:effectExtent l="0" t="0" r="0" b="9525"/>
+            <wp:docPr id="2039116323" name="Image 1"/>
+            <wp:cNvGraphicFramePr>
+              <a:graphicFrameLocks xmlns:a="http://schemas.openxmlformats.org/drawingml/2006/main" noChangeAspect="1"/>
+            </wp:cNvGraphicFramePr>
+            <a:graphic xmlns:a="http://schemas.openxmlformats.org/drawingml/2006/main">
+              <a:graphicData uri="http://schemas.openxmlformats.org/drawingml/2006/picture">
+                <pic:pic xmlns:pic="http://schemas.openxmlformats.org/drawingml/2006/picture">
+                  <pic:nvPicPr>
+                    <pic:cNvPr id="2039116323" name=""/>
+                    <pic:cNvPicPr/>
+                  </pic:nvPicPr>
+                  <pic:blipFill>
+                    <a:blip r:embed="rId15"/>
+                    <a:stretch>
+                      <a:fillRect/>
+                    </a:stretch>
+                  </pic:blipFill>
+                  <pic:spPr>
+                    <a:xfrm>
+                      <a:off x="0" y="0"/>
+                      <a:ext cx="1848108" cy="238158"/>
+                    </a:xfrm>
+                    <a:prstGeom prst="rect">
+                      <a:avLst/>
+                    </a:prstGeom>
+                  </pic:spPr>
+                </pic:pic>
+              </a:graphicData>
+            </a:graphic>
+          </wp:inline>
+        </w:drawing>
+      </w:r>
+    </w:p>
+    <w:p>
+      <w:pPr>
+        <w:pStyle w:val="Paragraphedeliste"/>
         <w:numPr>
           <w:ilvl w:val="0"/>
           <w:numId w:val="38"/>
@@ -423,6 +644,63 @@
     <w:p>
       <w:pPr>
         <w:pStyle w:val="Paragraphedeliste"/>
+        <w:spacing w:before="0" w:after="160" w:line="259" w:lineRule="auto"/>
+        <w:rPr>
+          <w:rStyle w:val="CodeCar"/>
+          <w:rFonts w:asciiTheme="minorHAnsi" w:eastAsiaTheme="minorEastAsia" w:hAnsiTheme="minorHAnsi"/>
+          <w:noProof w:val="0"/>
+          <w:sz w:val="20"/>
+          <w:szCs w:val="20"/>
+        </w:rPr>
+      </w:pPr>
+      <w:r>
+        <w:rPr>
+          <w:rStyle w:val="CodeCar"/>
+          <w:rFonts w:asciiTheme="minorHAnsi" w:eastAsiaTheme="minorEastAsia" w:hAnsiTheme="minorHAnsi"/>
+          <w:noProof w:val="0"/>
+          <w:sz w:val="20"/>
+          <w:szCs w:val="20"/>
+        </w:rPr>
+        <w:drawing>
+          <wp:inline distT="0" distB="0" distL="0" distR="0" wp14:anchorId="015FD8C4" wp14:editId="550B995D">
+            <wp:extent cx="5544324" cy="466790"/>
+            <wp:effectExtent l="0" t="0" r="0" b="9525"/>
+            <wp:docPr id="1507819936" name="Image 1"/>
+            <wp:cNvGraphicFramePr>
+              <a:graphicFrameLocks xmlns:a="http://schemas.openxmlformats.org/drawingml/2006/main" noChangeAspect="1"/>
+            </wp:cNvGraphicFramePr>
+            <a:graphic xmlns:a="http://schemas.openxmlformats.org/drawingml/2006/main">
+              <a:graphicData uri="http://schemas.openxmlformats.org/drawingml/2006/picture">
+                <pic:pic xmlns:pic="http://schemas.openxmlformats.org/drawingml/2006/picture">
+                  <pic:nvPicPr>
+                    <pic:cNvPr id="1507819936" name=""/>
+                    <pic:cNvPicPr/>
+                  </pic:nvPicPr>
+                  <pic:blipFill>
+                    <a:blip r:embed="rId16"/>
+                    <a:stretch>
+                      <a:fillRect/>
+                    </a:stretch>
+                  </pic:blipFill>
+                  <pic:spPr>
+                    <a:xfrm>
+                      <a:off x="0" y="0"/>
+                      <a:ext cx="5544324" cy="466790"/>
+                    </a:xfrm>
+                    <a:prstGeom prst="rect">
+                      <a:avLst/>
+                    </a:prstGeom>
+                  </pic:spPr>
+                </pic:pic>
+              </a:graphicData>
+            </a:graphic>
+          </wp:inline>
+        </w:drawing>
+      </w:r>
+    </w:p>
+    <w:p>
+      <w:pPr>
+        <w:pStyle w:val="Paragraphedeliste"/>
         <w:numPr>
           <w:ilvl w:val="0"/>
           <w:numId w:val="38"/>
@@ -448,6 +726,49 @@
     <w:p>
       <w:pPr>
         <w:pStyle w:val="Paragraphedeliste"/>
+        <w:spacing w:before="0" w:after="160" w:line="259" w:lineRule="auto"/>
+      </w:pPr>
+      <w:r>
+        <w:drawing>
+          <wp:inline distT="0" distB="0" distL="0" distR="0" wp14:anchorId="77DEA3B0" wp14:editId="333A9D0F">
+            <wp:extent cx="4096322" cy="238158"/>
+            <wp:effectExtent l="0" t="0" r="0" b="9525"/>
+            <wp:docPr id="1626136214" name="Image 1"/>
+            <wp:cNvGraphicFramePr>
+              <a:graphicFrameLocks xmlns:a="http://schemas.openxmlformats.org/drawingml/2006/main" noChangeAspect="1"/>
+            </wp:cNvGraphicFramePr>
+            <a:graphic xmlns:a="http://schemas.openxmlformats.org/drawingml/2006/main">
+              <a:graphicData uri="http://schemas.openxmlformats.org/drawingml/2006/picture">
+                <pic:pic xmlns:pic="http://schemas.openxmlformats.org/drawingml/2006/picture">
+                  <pic:nvPicPr>
+                    <pic:cNvPr id="1626136214" name=""/>
+                    <pic:cNvPicPr/>
+                  </pic:nvPicPr>
+                  <pic:blipFill>
+                    <a:blip r:embed="rId17"/>
+                    <a:stretch>
+                      <a:fillRect/>
+                    </a:stretch>
+                  </pic:blipFill>
+                  <pic:spPr>
+                    <a:xfrm>
+                      <a:off x="0" y="0"/>
+                      <a:ext cx="4096322" cy="238158"/>
+                    </a:xfrm>
+                    <a:prstGeom prst="rect">
+                      <a:avLst/>
+                    </a:prstGeom>
+                  </pic:spPr>
+                </pic:pic>
+              </a:graphicData>
+            </a:graphic>
+          </wp:inline>
+        </w:drawing>
+      </w:r>
+    </w:p>
+    <w:p>
+      <w:pPr>
+        <w:pStyle w:val="Paragraphedeliste"/>
         <w:numPr>
           <w:ilvl w:val="0"/>
           <w:numId w:val="38"/>
@@ -507,6 +828,63 @@
     <w:p>
       <w:pPr>
         <w:pStyle w:val="Paragraphedeliste"/>
+        <w:spacing w:before="0" w:after="160" w:line="259" w:lineRule="auto"/>
+        <w:rPr>
+          <w:rStyle w:val="CodeCar"/>
+          <w:rFonts w:asciiTheme="minorHAnsi" w:eastAsiaTheme="minorEastAsia" w:hAnsiTheme="minorHAnsi"/>
+          <w:noProof w:val="0"/>
+          <w:sz w:val="20"/>
+          <w:szCs w:val="20"/>
+        </w:rPr>
+      </w:pPr>
+      <w:r>
+        <w:rPr>
+          <w:rStyle w:val="CodeCar"/>
+          <w:rFonts w:asciiTheme="minorHAnsi" w:eastAsiaTheme="minorEastAsia" w:hAnsiTheme="minorHAnsi"/>
+          <w:noProof w:val="0"/>
+          <w:sz w:val="20"/>
+          <w:szCs w:val="20"/>
+        </w:rPr>
+        <w:drawing>
+          <wp:inline distT="0" distB="0" distL="0" distR="0" wp14:anchorId="5CFBC531" wp14:editId="5945E6B3">
+            <wp:extent cx="5943600" cy="191770"/>
+            <wp:effectExtent l="0" t="0" r="0" b="0"/>
+            <wp:docPr id="546535281" name="Image 1"/>
+            <wp:cNvGraphicFramePr>
+              <a:graphicFrameLocks xmlns:a="http://schemas.openxmlformats.org/drawingml/2006/main" noChangeAspect="1"/>
+            </wp:cNvGraphicFramePr>
+            <a:graphic xmlns:a="http://schemas.openxmlformats.org/drawingml/2006/main">
+              <a:graphicData uri="http://schemas.openxmlformats.org/drawingml/2006/picture">
+                <pic:pic xmlns:pic="http://schemas.openxmlformats.org/drawingml/2006/picture">
+                  <pic:nvPicPr>
+                    <pic:cNvPr id="546535281" name=""/>
+                    <pic:cNvPicPr/>
+                  </pic:nvPicPr>
+                  <pic:blipFill>
+                    <a:blip r:embed="rId18"/>
+                    <a:stretch>
+                      <a:fillRect/>
+                    </a:stretch>
+                  </pic:blipFill>
+                  <pic:spPr>
+                    <a:xfrm>
+                      <a:off x="0" y="0"/>
+                      <a:ext cx="5943600" cy="191770"/>
+                    </a:xfrm>
+                    <a:prstGeom prst="rect">
+                      <a:avLst/>
+                    </a:prstGeom>
+                  </pic:spPr>
+                </pic:pic>
+              </a:graphicData>
+            </a:graphic>
+          </wp:inline>
+        </w:drawing>
+      </w:r>
+    </w:p>
+    <w:p>
+      <w:pPr>
+        <w:pStyle w:val="Paragraphedeliste"/>
         <w:numPr>
           <w:ilvl w:val="0"/>
           <w:numId w:val="38"/>
@@ -523,6 +901,92 @@
     <w:p>
       <w:pPr>
         <w:pStyle w:val="Paragraphedeliste"/>
+        <w:spacing w:before="0" w:after="160" w:line="259" w:lineRule="auto"/>
+      </w:pPr>
+      <w:r>
+        <w:drawing>
+          <wp:inline distT="0" distB="0" distL="0" distR="0" wp14:anchorId="7A37A9C2" wp14:editId="0A80256C">
+            <wp:extent cx="5943600" cy="347980"/>
+            <wp:effectExtent l="0" t="0" r="0" b="0"/>
+            <wp:docPr id="2056145141" name="Image 1"/>
+            <wp:cNvGraphicFramePr>
+              <a:graphicFrameLocks xmlns:a="http://schemas.openxmlformats.org/drawingml/2006/main" noChangeAspect="1"/>
+            </wp:cNvGraphicFramePr>
+            <a:graphic xmlns:a="http://schemas.openxmlformats.org/drawingml/2006/main">
+              <a:graphicData uri="http://schemas.openxmlformats.org/drawingml/2006/picture">
+                <pic:pic xmlns:pic="http://schemas.openxmlformats.org/drawingml/2006/picture">
+                  <pic:nvPicPr>
+                    <pic:cNvPr id="2056145141" name=""/>
+                    <pic:cNvPicPr/>
+                  </pic:nvPicPr>
+                  <pic:blipFill>
+                    <a:blip r:embed="rId19"/>
+                    <a:stretch>
+                      <a:fillRect/>
+                    </a:stretch>
+                  </pic:blipFill>
+                  <pic:spPr>
+                    <a:xfrm>
+                      <a:off x="0" y="0"/>
+                      <a:ext cx="5943600" cy="347980"/>
+                    </a:xfrm>
+                    <a:prstGeom prst="rect">
+                      <a:avLst/>
+                    </a:prstGeom>
+                  </pic:spPr>
+                </pic:pic>
+              </a:graphicData>
+            </a:graphic>
+          </wp:inline>
+        </w:drawing>
+      </w:r>
+    </w:p>
+    <w:p>
+      <w:pPr>
+        <w:pStyle w:val="Paragraphedeliste"/>
+        <w:spacing w:before="0" w:after="160" w:line="259" w:lineRule="auto"/>
+      </w:pPr>
+      <w:r>
+        <w:drawing>
+          <wp:inline distT="0" distB="0" distL="0" distR="0" wp14:anchorId="282196F3" wp14:editId="2BA89E9A">
+            <wp:extent cx="3429479" cy="257211"/>
+            <wp:effectExtent l="0" t="0" r="0" b="9525"/>
+            <wp:docPr id="691783327" name="Image 1"/>
+            <wp:cNvGraphicFramePr>
+              <a:graphicFrameLocks xmlns:a="http://schemas.openxmlformats.org/drawingml/2006/main" noChangeAspect="1"/>
+            </wp:cNvGraphicFramePr>
+            <a:graphic xmlns:a="http://schemas.openxmlformats.org/drawingml/2006/main">
+              <a:graphicData uri="http://schemas.openxmlformats.org/drawingml/2006/picture">
+                <pic:pic xmlns:pic="http://schemas.openxmlformats.org/drawingml/2006/picture">
+                  <pic:nvPicPr>
+                    <pic:cNvPr id="691783327" name=""/>
+                    <pic:cNvPicPr/>
+                  </pic:nvPicPr>
+                  <pic:blipFill>
+                    <a:blip r:embed="rId20"/>
+                    <a:stretch>
+                      <a:fillRect/>
+                    </a:stretch>
+                  </pic:blipFill>
+                  <pic:spPr>
+                    <a:xfrm>
+                      <a:off x="0" y="0"/>
+                      <a:ext cx="3429479" cy="257211"/>
+                    </a:xfrm>
+                    <a:prstGeom prst="rect">
+                      <a:avLst/>
+                    </a:prstGeom>
+                  </pic:spPr>
+                </pic:pic>
+              </a:graphicData>
+            </a:graphic>
+          </wp:inline>
+        </w:drawing>
+      </w:r>
+    </w:p>
+    <w:p>
+      <w:pPr>
+        <w:pStyle w:val="Paragraphedeliste"/>
         <w:numPr>
           <w:ilvl w:val="0"/>
           <w:numId w:val="38"/>
@@ -539,6 +1003,49 @@
     <w:p>
       <w:pPr>
         <w:pStyle w:val="Paragraphedeliste"/>
+        <w:spacing w:before="0" w:after="160" w:line="259" w:lineRule="auto"/>
+      </w:pPr>
+      <w:r>
+        <w:drawing>
+          <wp:inline distT="0" distB="0" distL="0" distR="0" wp14:anchorId="157527EA" wp14:editId="4A890B6E">
+            <wp:extent cx="1790950" cy="276264"/>
+            <wp:effectExtent l="0" t="0" r="0" b="9525"/>
+            <wp:docPr id="1701324904" name="Image 1"/>
+            <wp:cNvGraphicFramePr>
+              <a:graphicFrameLocks xmlns:a="http://schemas.openxmlformats.org/drawingml/2006/main" noChangeAspect="1"/>
+            </wp:cNvGraphicFramePr>
+            <a:graphic xmlns:a="http://schemas.openxmlformats.org/drawingml/2006/main">
+              <a:graphicData uri="http://schemas.openxmlformats.org/drawingml/2006/picture">
+                <pic:pic xmlns:pic="http://schemas.openxmlformats.org/drawingml/2006/picture">
+                  <pic:nvPicPr>
+                    <pic:cNvPr id="1701324904" name=""/>
+                    <pic:cNvPicPr/>
+                  </pic:nvPicPr>
+                  <pic:blipFill>
+                    <a:blip r:embed="rId21"/>
+                    <a:stretch>
+                      <a:fillRect/>
+                    </a:stretch>
+                  </pic:blipFill>
+                  <pic:spPr>
+                    <a:xfrm>
+                      <a:off x="0" y="0"/>
+                      <a:ext cx="1790950" cy="276264"/>
+                    </a:xfrm>
+                    <a:prstGeom prst="rect">
+                      <a:avLst/>
+                    </a:prstGeom>
+                  </pic:spPr>
+                </pic:pic>
+              </a:graphicData>
+            </a:graphic>
+          </wp:inline>
+        </w:drawing>
+      </w:r>
+    </w:p>
+    <w:p>
+      <w:pPr>
+        <w:pStyle w:val="Paragraphedeliste"/>
         <w:numPr>
           <w:ilvl w:val="0"/>
           <w:numId w:val="38"/>
@@ -580,11 +1087,63 @@
     <w:p>
       <w:pPr>
         <w:pStyle w:val="Paragraphedeliste"/>
+        <w:spacing w:before="0" w:after="160" w:line="259" w:lineRule="auto"/>
+        <w:ind w:left="1440"/>
+      </w:pPr>
+      <w:r>
+        <w:lastRenderedPageBreak/>
+        <w:drawing>
+          <wp:inline distT="0" distB="0" distL="0" distR="0" wp14:anchorId="3A4D4F14" wp14:editId="156C4BF2">
+            <wp:extent cx="5943600" cy="685800"/>
+            <wp:effectExtent l="0" t="0" r="0" b="0"/>
+            <wp:docPr id="2063254569" name="Image 1"/>
+            <wp:cNvGraphicFramePr>
+              <a:graphicFrameLocks xmlns:a="http://schemas.openxmlformats.org/drawingml/2006/main" noChangeAspect="1"/>
+            </wp:cNvGraphicFramePr>
+            <a:graphic xmlns:a="http://schemas.openxmlformats.org/drawingml/2006/main">
+              <a:graphicData uri="http://schemas.openxmlformats.org/drawingml/2006/picture">
+                <pic:pic xmlns:pic="http://schemas.openxmlformats.org/drawingml/2006/picture">
+                  <pic:nvPicPr>
+                    <pic:cNvPr id="2063254569" name=""/>
+                    <pic:cNvPicPr/>
+                  </pic:nvPicPr>
+                  <pic:blipFill>
+                    <a:blip r:embed="rId22"/>
+                    <a:stretch>
+                      <a:fillRect/>
+                    </a:stretch>
+                  </pic:blipFill>
+                  <pic:spPr>
+                    <a:xfrm>
+                      <a:off x="0" y="0"/>
+                      <a:ext cx="5943600" cy="685800"/>
+                    </a:xfrm>
+                    <a:prstGeom prst="rect">
+                      <a:avLst/>
+                    </a:prstGeom>
+                  </pic:spPr>
+                </pic:pic>
+              </a:graphicData>
+            </a:graphic>
+          </wp:inline>
+        </w:drawing>
+      </w:r>
+    </w:p>
+    <w:p>
+      <w:pPr>
+        <w:pStyle w:val="Paragraphedeliste"/>
         <w:numPr>
           <w:ilvl w:val="1"/>
           <w:numId w:val="38"/>
         </w:numPr>
         <w:spacing w:before="0" w:after="160" w:line="259" w:lineRule="auto"/>
+        <w:rPr>
+          <w:rStyle w:val="CodeCar"/>
+          <w:rFonts w:asciiTheme="minorHAnsi" w:eastAsiaTheme="minorEastAsia" w:hAnsiTheme="minorHAnsi"/>
+          <w:noProof w:val="0"/>
+          <w:sz w:val="20"/>
+          <w:szCs w:val="20"/>
+        </w:rPr>
       </w:pPr>
       <w:r>
         <w:t xml:space="preserve">Nommer </w:t>
@@ -612,6 +1171,50 @@
           <w:rStyle w:val="CodeCar"/>
         </w:rPr>
         <w:t>d138</w:t>
+      </w:r>
+    </w:p>
+    <w:p>
+      <w:pPr>
+        <w:pStyle w:val="Paragraphedeliste"/>
+        <w:spacing w:before="0" w:after="160" w:line="259" w:lineRule="auto"/>
+        <w:ind w:left="1440"/>
+      </w:pPr>
+      <w:r>
+        <w:drawing>
+          <wp:inline distT="0" distB="0" distL="0" distR="0" wp14:anchorId="3EBDDEBA" wp14:editId="151648A2">
+            <wp:extent cx="4486901" cy="266737"/>
+            <wp:effectExtent l="0" t="0" r="9525" b="0"/>
+            <wp:docPr id="1050985775" name="Image 1"/>
+            <wp:cNvGraphicFramePr>
+              <a:graphicFrameLocks xmlns:a="http://schemas.openxmlformats.org/drawingml/2006/main" noChangeAspect="1"/>
+            </wp:cNvGraphicFramePr>
+            <a:graphic xmlns:a="http://schemas.openxmlformats.org/drawingml/2006/main">
+              <a:graphicData uri="http://schemas.openxmlformats.org/drawingml/2006/picture">
+                <pic:pic xmlns:pic="http://schemas.openxmlformats.org/drawingml/2006/picture">
+                  <pic:nvPicPr>
+                    <pic:cNvPr id="1050985775" name=""/>
+                    <pic:cNvPicPr/>
+                  </pic:nvPicPr>
+                  <pic:blipFill>
+                    <a:blip r:embed="rId23"/>
+                    <a:stretch>
+                      <a:fillRect/>
+                    </a:stretch>
+                  </pic:blipFill>
+                  <pic:spPr>
+                    <a:xfrm>
+                      <a:off x="0" y="0"/>
+                      <a:ext cx="4486901" cy="266737"/>
+                    </a:xfrm>
+                    <a:prstGeom prst="rect">
+                      <a:avLst/>
+                    </a:prstGeom>
+                  </pic:spPr>
+                </pic:pic>
+              </a:graphicData>
+            </a:graphic>
+          </wp:inline>
+        </w:drawing>
       </w:r>
     </w:p>
     <w:p>
@@ -660,11 +1263,133 @@
     <w:p>
       <w:pPr>
         <w:pStyle w:val="Paragraphedeliste"/>
+        <w:spacing w:before="0" w:after="160" w:line="259" w:lineRule="auto"/>
+        <w:ind w:left="1440"/>
+      </w:pPr>
+      <w:r>
+        <w:drawing>
+          <wp:inline distT="0" distB="0" distL="0" distR="0" wp14:anchorId="231FA96B" wp14:editId="4044E9AE">
+            <wp:extent cx="5943600" cy="1039495"/>
+            <wp:effectExtent l="0" t="0" r="0" b="8255"/>
+            <wp:docPr id="1729841432" name="Image 1"/>
+            <wp:cNvGraphicFramePr>
+              <a:graphicFrameLocks xmlns:a="http://schemas.openxmlformats.org/drawingml/2006/main" noChangeAspect="1"/>
+            </wp:cNvGraphicFramePr>
+            <a:graphic xmlns:a="http://schemas.openxmlformats.org/drawingml/2006/main">
+              <a:graphicData uri="http://schemas.openxmlformats.org/drawingml/2006/picture">
+                <pic:pic xmlns:pic="http://schemas.openxmlformats.org/drawingml/2006/picture">
+                  <pic:nvPicPr>
+                    <pic:cNvPr id="1729841432" name=""/>
+                    <pic:cNvPicPr/>
+                  </pic:nvPicPr>
+                  <pic:blipFill>
+                    <a:blip r:embed="rId24"/>
+                    <a:stretch>
+                      <a:fillRect/>
+                    </a:stretch>
+                  </pic:blipFill>
+                  <pic:spPr>
+                    <a:xfrm>
+                      <a:off x="0" y="0"/>
+                      <a:ext cx="5943600" cy="1039495"/>
+                    </a:xfrm>
+                    <a:prstGeom prst="rect">
+                      <a:avLst/>
+                    </a:prstGeom>
+                  </pic:spPr>
+                </pic:pic>
+              </a:graphicData>
+            </a:graphic>
+          </wp:inline>
+        </w:drawing>
+      </w:r>
+    </w:p>
+    <w:p>
+      <w:pPr>
+        <w:pStyle w:val="Paragraphedeliste"/>
+        <w:spacing w:before="0" w:after="160" w:line="259" w:lineRule="auto"/>
+        <w:ind w:left="1440"/>
+      </w:pPr>
+      <w:r>
+        <w:drawing>
+          <wp:inline distT="0" distB="0" distL="0" distR="0" wp14:anchorId="687DD615" wp14:editId="0898748A">
+            <wp:extent cx="5943600" cy="2966720"/>
+            <wp:effectExtent l="0" t="0" r="0" b="5080"/>
+            <wp:docPr id="302267755" name="Image 1"/>
+            <wp:cNvGraphicFramePr>
+              <a:graphicFrameLocks xmlns:a="http://schemas.openxmlformats.org/drawingml/2006/main" noChangeAspect="1"/>
+            </wp:cNvGraphicFramePr>
+            <a:graphic xmlns:a="http://schemas.openxmlformats.org/drawingml/2006/main">
+              <a:graphicData uri="http://schemas.openxmlformats.org/drawingml/2006/picture">
+                <pic:pic xmlns:pic="http://schemas.openxmlformats.org/drawingml/2006/picture">
+                  <pic:nvPicPr>
+                    <pic:cNvPr id="302267755" name=""/>
+                    <pic:cNvPicPr/>
+                  </pic:nvPicPr>
+                  <pic:blipFill>
+                    <a:blip r:embed="rId25"/>
+                    <a:stretch>
+                      <a:fillRect/>
+                    </a:stretch>
+                  </pic:blipFill>
+                  <pic:spPr>
+                    <a:xfrm>
+                      <a:off x="0" y="0"/>
+                      <a:ext cx="5943600" cy="2966720"/>
+                    </a:xfrm>
+                    <a:prstGeom prst="rect">
+                      <a:avLst/>
+                    </a:prstGeom>
+                  </pic:spPr>
+                </pic:pic>
+              </a:graphicData>
+            </a:graphic>
+          </wp:inline>
+        </w:drawing>
+      </w:r>
+    </w:p>
+    <w:p>
+      <w:pPr>
+        <w:pStyle w:val="Paragraphedeliste"/>
         <w:numPr>
           <w:ilvl w:val="1"/>
           <w:numId w:val="38"/>
         </w:numPr>
         <w:spacing w:before="0" w:after="160" w:line="259" w:lineRule="auto"/>
+      </w:pPr>
+      <w:r>
+        <w:t xml:space="preserve">Configurer l’adresse IP </w:t>
+      </w:r>
+      <w:r>
+        <w:rPr>
+          <w:rStyle w:val="CodeCar"/>
+        </w:rPr>
+        <w:t>192.168.</w:t>
+      </w:r>
+      <w:r>
+        <w:rPr>
+          <w:rStyle w:val="CodeCar"/>
+        </w:rPr>
+        <w:t>138</w:t>
+      </w:r>
+      <w:r>
+        <w:rPr>
+          <w:rStyle w:val="CodeCar"/>
+        </w:rPr>
+        <w:t>.2</w:t>
+      </w:r>
+      <w:r>
+        <w:t xml:space="preserve"> pour la Switch</w:t>
+      </w:r>
+      <w:r>
+        <w:t xml:space="preserve"> sur le VLAN 1</w:t>
+      </w:r>
+    </w:p>
+    <w:p>
+      <w:pPr>
+        <w:pStyle w:val="Paragraphedeliste"/>
+        <w:spacing w:before="0" w:after="160" w:line="259" w:lineRule="auto"/>
+        <w:ind w:left="1440"/>
         <w:rPr>
           <w:rStyle w:val="CodeCar"/>
           <w:rFonts w:asciiTheme="minorHAnsi" w:eastAsiaTheme="minorEastAsia" w:hAnsiTheme="minorHAnsi"/>
@@ -674,31 +1399,48 @@
         </w:rPr>
       </w:pPr>
       <w:r>
-        <w:t xml:space="preserve">Configurer l’adresse IP </w:t>
-      </w:r>
-      <w:r>
-        <w:rPr>
-          <w:rStyle w:val="CodeCar"/>
-        </w:rPr>
-        <w:t>192.168.</w:t>
-      </w:r>
-      <w:r>
-        <w:rPr>
-          <w:rStyle w:val="CodeCar"/>
-        </w:rPr>
-        <w:t>138</w:t>
-      </w:r>
-      <w:r>
-        <w:rPr>
-          <w:rStyle w:val="CodeCar"/>
-        </w:rPr>
-        <w:t>.2</w:t>
-      </w:r>
-      <w:r>
-        <w:t xml:space="preserve"> pour la Switch</w:t>
-      </w:r>
-      <w:r>
-        <w:t xml:space="preserve"> sur le VLAN 1</w:t>
+        <w:rPr>
+          <w:rStyle w:val="CodeCar"/>
+          <w:rFonts w:asciiTheme="minorHAnsi" w:eastAsiaTheme="minorEastAsia" w:hAnsiTheme="minorHAnsi"/>
+          <w:noProof w:val="0"/>
+          <w:sz w:val="20"/>
+          <w:szCs w:val="20"/>
+        </w:rPr>
+        <w:drawing>
+          <wp:inline distT="0" distB="0" distL="0" distR="0" wp14:anchorId="5F070852" wp14:editId="613BEF23">
+            <wp:extent cx="5943600" cy="879475"/>
+            <wp:effectExtent l="0" t="0" r="0" b="0"/>
+            <wp:docPr id="637831434" name="Image 1"/>
+            <wp:cNvGraphicFramePr>
+              <a:graphicFrameLocks xmlns:a="http://schemas.openxmlformats.org/drawingml/2006/main" noChangeAspect="1"/>
+            </wp:cNvGraphicFramePr>
+            <a:graphic xmlns:a="http://schemas.openxmlformats.org/drawingml/2006/main">
+              <a:graphicData uri="http://schemas.openxmlformats.org/drawingml/2006/picture">
+                <pic:pic xmlns:pic="http://schemas.openxmlformats.org/drawingml/2006/picture">
+                  <pic:nvPicPr>
+                    <pic:cNvPr id="637831434" name=""/>
+                    <pic:cNvPicPr/>
+                  </pic:nvPicPr>
+                  <pic:blipFill>
+                    <a:blip r:embed="rId26"/>
+                    <a:stretch>
+                      <a:fillRect/>
+                    </a:stretch>
+                  </pic:blipFill>
+                  <pic:spPr>
+                    <a:xfrm>
+                      <a:off x="0" y="0"/>
+                      <a:ext cx="5943600" cy="879475"/>
+                    </a:xfrm>
+                    <a:prstGeom prst="rect">
+                      <a:avLst/>
+                    </a:prstGeom>
+                  </pic:spPr>
+                </pic:pic>
+              </a:graphicData>
+            </a:graphic>
+          </wp:inline>
+        </w:drawing>
       </w:r>
     </w:p>
     <w:p>
@@ -720,6 +1462,50 @@
     <w:p>
       <w:pPr>
         <w:pStyle w:val="Paragraphedeliste"/>
+        <w:spacing w:before="0" w:after="160" w:line="259" w:lineRule="auto"/>
+        <w:ind w:left="1440"/>
+      </w:pPr>
+      <w:r>
+        <w:drawing>
+          <wp:inline distT="0" distB="0" distL="0" distR="0" wp14:anchorId="0681360D" wp14:editId="26033F1B">
+            <wp:extent cx="5430008" cy="266737"/>
+            <wp:effectExtent l="0" t="0" r="0" b="0"/>
+            <wp:docPr id="2133797034" name="Image 1"/>
+            <wp:cNvGraphicFramePr>
+              <a:graphicFrameLocks xmlns:a="http://schemas.openxmlformats.org/drawingml/2006/main" noChangeAspect="1"/>
+            </wp:cNvGraphicFramePr>
+            <a:graphic xmlns:a="http://schemas.openxmlformats.org/drawingml/2006/main">
+              <a:graphicData uri="http://schemas.openxmlformats.org/drawingml/2006/picture">
+                <pic:pic xmlns:pic="http://schemas.openxmlformats.org/drawingml/2006/picture">
+                  <pic:nvPicPr>
+                    <pic:cNvPr id="2133797034" name=""/>
+                    <pic:cNvPicPr/>
+                  </pic:nvPicPr>
+                  <pic:blipFill>
+                    <a:blip r:embed="rId27"/>
+                    <a:stretch>
+                      <a:fillRect/>
+                    </a:stretch>
+                  </pic:blipFill>
+                  <pic:spPr>
+                    <a:xfrm>
+                      <a:off x="0" y="0"/>
+                      <a:ext cx="5430008" cy="266737"/>
+                    </a:xfrm>
+                    <a:prstGeom prst="rect">
+                      <a:avLst/>
+                    </a:prstGeom>
+                  </pic:spPr>
+                </pic:pic>
+              </a:graphicData>
+            </a:graphic>
+          </wp:inline>
+        </w:drawing>
+      </w:r>
+    </w:p>
+    <w:p>
+      <w:pPr>
+        <w:pStyle w:val="Paragraphedeliste"/>
         <w:numPr>
           <w:ilvl w:val="1"/>
           <w:numId w:val="38"/>
@@ -733,6 +1519,50 @@
     <w:p>
       <w:pPr>
         <w:pStyle w:val="Paragraphedeliste"/>
+        <w:spacing w:before="0" w:after="160" w:line="259" w:lineRule="auto"/>
+        <w:ind w:left="1440"/>
+      </w:pPr>
+      <w:r>
+        <w:drawing>
+          <wp:inline distT="0" distB="0" distL="0" distR="0" wp14:anchorId="46322119" wp14:editId="0C2C98D9">
+            <wp:extent cx="3648584" cy="238158"/>
+            <wp:effectExtent l="0" t="0" r="9525" b="9525"/>
+            <wp:docPr id="681191718" name="Image 1"/>
+            <wp:cNvGraphicFramePr>
+              <a:graphicFrameLocks xmlns:a="http://schemas.openxmlformats.org/drawingml/2006/main" noChangeAspect="1"/>
+            </wp:cNvGraphicFramePr>
+            <a:graphic xmlns:a="http://schemas.openxmlformats.org/drawingml/2006/main">
+              <a:graphicData uri="http://schemas.openxmlformats.org/drawingml/2006/picture">
+                <pic:pic xmlns:pic="http://schemas.openxmlformats.org/drawingml/2006/picture">
+                  <pic:nvPicPr>
+                    <pic:cNvPr id="681191718" name=""/>
+                    <pic:cNvPicPr/>
+                  </pic:nvPicPr>
+                  <pic:blipFill>
+                    <a:blip r:embed="rId28"/>
+                    <a:stretch>
+                      <a:fillRect/>
+                    </a:stretch>
+                  </pic:blipFill>
+                  <pic:spPr>
+                    <a:xfrm>
+                      <a:off x="0" y="0"/>
+                      <a:ext cx="3648584" cy="238158"/>
+                    </a:xfrm>
+                    <a:prstGeom prst="rect">
+                      <a:avLst/>
+                    </a:prstGeom>
+                  </pic:spPr>
+                </pic:pic>
+              </a:graphicData>
+            </a:graphic>
+          </wp:inline>
+        </w:drawing>
+      </w:r>
+    </w:p>
+    <w:p>
+      <w:pPr>
+        <w:pStyle w:val="Paragraphedeliste"/>
         <w:numPr>
           <w:ilvl w:val="0"/>
           <w:numId w:val="38"/>
@@ -983,6 +1813,7 @@
           <w:sz w:val="20"/>
           <w:szCs w:val="20"/>
         </w:rPr>
+        <w:lastRenderedPageBreak/>
         <w:t>Tester avec</w:t>
       </w:r>
       <w:r>
@@ -1017,6 +1848,64 @@
     <w:p>
       <w:pPr>
         <w:pStyle w:val="Paragraphedeliste"/>
+        <w:spacing w:before="0" w:after="160" w:line="259" w:lineRule="auto"/>
+        <w:ind w:left="2160"/>
+        <w:rPr>
+          <w:rStyle w:val="CodeCar"/>
+          <w:rFonts w:asciiTheme="minorHAnsi" w:eastAsiaTheme="minorEastAsia" w:hAnsiTheme="minorHAnsi"/>
+          <w:noProof w:val="0"/>
+          <w:sz w:val="20"/>
+          <w:szCs w:val="20"/>
+        </w:rPr>
+      </w:pPr>
+      <w:r>
+        <w:rPr>
+          <w:rStyle w:val="CodeCar"/>
+          <w:rFonts w:asciiTheme="minorHAnsi" w:eastAsiaTheme="minorEastAsia" w:hAnsiTheme="minorHAnsi"/>
+          <w:noProof w:val="0"/>
+          <w:sz w:val="20"/>
+          <w:szCs w:val="20"/>
+        </w:rPr>
+        <w:drawing>
+          <wp:inline distT="0" distB="0" distL="0" distR="0" wp14:anchorId="13952E36" wp14:editId="33377FEF">
+            <wp:extent cx="5943600" cy="2240280"/>
+            <wp:effectExtent l="0" t="0" r="0" b="7620"/>
+            <wp:docPr id="587706649" name="Image 1"/>
+            <wp:cNvGraphicFramePr>
+              <a:graphicFrameLocks xmlns:a="http://schemas.openxmlformats.org/drawingml/2006/main" noChangeAspect="1"/>
+            </wp:cNvGraphicFramePr>
+            <a:graphic xmlns:a="http://schemas.openxmlformats.org/drawingml/2006/main">
+              <a:graphicData uri="http://schemas.openxmlformats.org/drawingml/2006/picture">
+                <pic:pic xmlns:pic="http://schemas.openxmlformats.org/drawingml/2006/picture">
+                  <pic:nvPicPr>
+                    <pic:cNvPr id="587706649" name=""/>
+                    <pic:cNvPicPr/>
+                  </pic:nvPicPr>
+                  <pic:blipFill>
+                    <a:blip r:embed="rId29"/>
+                    <a:stretch>
+                      <a:fillRect/>
+                    </a:stretch>
+                  </pic:blipFill>
+                  <pic:spPr>
+                    <a:xfrm>
+                      <a:off x="0" y="0"/>
+                      <a:ext cx="5943600" cy="2240280"/>
+                    </a:xfrm>
+                    <a:prstGeom prst="rect">
+                      <a:avLst/>
+                    </a:prstGeom>
+                  </pic:spPr>
+                </pic:pic>
+              </a:graphicData>
+            </a:graphic>
+          </wp:inline>
+        </w:drawing>
+      </w:r>
+    </w:p>
+    <w:p>
+      <w:pPr>
+        <w:pStyle w:val="Paragraphedeliste"/>
         <w:numPr>
           <w:ilvl w:val="2"/>
           <w:numId w:val="38"/>
@@ -1107,6 +1996,64 @@
     <w:p>
       <w:pPr>
         <w:pStyle w:val="Paragraphedeliste"/>
+        <w:spacing w:before="0" w:after="160" w:line="259" w:lineRule="auto"/>
+        <w:ind w:left="2880"/>
+        <w:rPr>
+          <w:rStyle w:val="CodeCar"/>
+          <w:rFonts w:asciiTheme="minorHAnsi" w:eastAsiaTheme="minorEastAsia" w:hAnsiTheme="minorHAnsi"/>
+          <w:noProof w:val="0"/>
+          <w:sz w:val="20"/>
+          <w:szCs w:val="20"/>
+        </w:rPr>
+      </w:pPr>
+      <w:r>
+        <w:rPr>
+          <w:rStyle w:val="CodeCar"/>
+          <w:rFonts w:asciiTheme="minorHAnsi" w:eastAsiaTheme="minorEastAsia" w:hAnsiTheme="minorHAnsi"/>
+          <w:noProof w:val="0"/>
+          <w:sz w:val="20"/>
+          <w:szCs w:val="20"/>
+        </w:rPr>
+        <w:drawing>
+          <wp:inline distT="0" distB="0" distL="0" distR="0" wp14:anchorId="57485E0A" wp14:editId="0E4C7D4D">
+            <wp:extent cx="5020376" cy="2076740"/>
+            <wp:effectExtent l="0" t="0" r="8890" b="0"/>
+            <wp:docPr id="574801691" name="Image 1"/>
+            <wp:cNvGraphicFramePr>
+              <a:graphicFrameLocks xmlns:a="http://schemas.openxmlformats.org/drawingml/2006/main" noChangeAspect="1"/>
+            </wp:cNvGraphicFramePr>
+            <a:graphic xmlns:a="http://schemas.openxmlformats.org/drawingml/2006/main">
+              <a:graphicData uri="http://schemas.openxmlformats.org/drawingml/2006/picture">
+                <pic:pic xmlns:pic="http://schemas.openxmlformats.org/drawingml/2006/picture">
+                  <pic:nvPicPr>
+                    <pic:cNvPr id="574801691" name=""/>
+                    <pic:cNvPicPr/>
+                  </pic:nvPicPr>
+                  <pic:blipFill>
+                    <a:blip r:embed="rId30"/>
+                    <a:stretch>
+                      <a:fillRect/>
+                    </a:stretch>
+                  </pic:blipFill>
+                  <pic:spPr>
+                    <a:xfrm>
+                      <a:off x="0" y="0"/>
+                      <a:ext cx="5020376" cy="2076740"/>
+                    </a:xfrm>
+                    <a:prstGeom prst="rect">
+                      <a:avLst/>
+                    </a:prstGeom>
+                  </pic:spPr>
+                </pic:pic>
+              </a:graphicData>
+            </a:graphic>
+          </wp:inline>
+        </w:drawing>
+      </w:r>
+    </w:p>
+    <w:p>
+      <w:pPr>
+        <w:pStyle w:val="Paragraphedeliste"/>
         <w:numPr>
           <w:ilvl w:val="3"/>
           <w:numId w:val="38"/>
@@ -1159,6 +2106,64 @@
           <w:szCs w:val="20"/>
         </w:rPr>
         <w:t xml:space="preserve"> de la Switch</w:t>
+      </w:r>
+    </w:p>
+    <w:p>
+      <w:pPr>
+        <w:pStyle w:val="Paragraphedeliste"/>
+        <w:spacing w:before="0" w:after="160" w:line="259" w:lineRule="auto"/>
+        <w:ind w:left="2880"/>
+        <w:rPr>
+          <w:rStyle w:val="CodeCar"/>
+          <w:rFonts w:asciiTheme="minorHAnsi" w:eastAsiaTheme="minorEastAsia" w:hAnsiTheme="minorHAnsi"/>
+          <w:noProof w:val="0"/>
+          <w:sz w:val="20"/>
+          <w:szCs w:val="20"/>
+        </w:rPr>
+      </w:pPr>
+      <w:r>
+        <w:rPr>
+          <w:rStyle w:val="CodeCar"/>
+          <w:rFonts w:asciiTheme="minorHAnsi" w:eastAsiaTheme="minorEastAsia" w:hAnsiTheme="minorHAnsi"/>
+          <w:noProof w:val="0"/>
+          <w:sz w:val="20"/>
+          <w:szCs w:val="20"/>
+        </w:rPr>
+        <w:drawing>
+          <wp:inline distT="0" distB="0" distL="0" distR="0" wp14:anchorId="410D1E10" wp14:editId="2F47214F">
+            <wp:extent cx="2829320" cy="304843"/>
+            <wp:effectExtent l="0" t="0" r="0" b="0"/>
+            <wp:docPr id="1835282873" name="Image 1"/>
+            <wp:cNvGraphicFramePr>
+              <a:graphicFrameLocks xmlns:a="http://schemas.openxmlformats.org/drawingml/2006/main" noChangeAspect="1"/>
+            </wp:cNvGraphicFramePr>
+            <a:graphic xmlns:a="http://schemas.openxmlformats.org/drawingml/2006/main">
+              <a:graphicData uri="http://schemas.openxmlformats.org/drawingml/2006/picture">
+                <pic:pic xmlns:pic="http://schemas.openxmlformats.org/drawingml/2006/picture">
+                  <pic:nvPicPr>
+                    <pic:cNvPr id="1835282873" name=""/>
+                    <pic:cNvPicPr/>
+                  </pic:nvPicPr>
+                  <pic:blipFill>
+                    <a:blip r:embed="rId31"/>
+                    <a:stretch>
+                      <a:fillRect/>
+                    </a:stretch>
+                  </pic:blipFill>
+                  <pic:spPr>
+                    <a:xfrm>
+                      <a:off x="0" y="0"/>
+                      <a:ext cx="2829320" cy="304843"/>
+                    </a:xfrm>
+                    <a:prstGeom prst="rect">
+                      <a:avLst/>
+                    </a:prstGeom>
+                  </pic:spPr>
+                </pic:pic>
+              </a:graphicData>
+            </a:graphic>
+          </wp:inline>
+        </w:drawing>
       </w:r>
     </w:p>
     <w:p>
@@ -2192,8 +3197,18 @@
           <w:sz w:val="20"/>
           <w:szCs w:val="20"/>
         </w:rPr>
-        <w:t>Afficher la configuration d</w:t>
-      </w:r>
+        <w:t>Afficher la configuration de la Switch</w:t>
+      </w:r>
+    </w:p>
+    <w:p>
+      <w:pPr>
+        <w:pStyle w:val="Paragraphedeliste"/>
+        <w:numPr>
+          <w:ilvl w:val="2"/>
+          <w:numId w:val="40"/>
+        </w:numPr>
+        <w:spacing w:before="0" w:after="160" w:line="259" w:lineRule="auto"/>
+      </w:pPr>
       <w:r>
         <w:rPr>
           <w:rStyle w:val="CodeCar"/>
@@ -2202,26 +3217,6 @@
           <w:sz w:val="20"/>
           <w:szCs w:val="20"/>
         </w:rPr>
-        <w:t>e la Switch</w:t>
-      </w:r>
-    </w:p>
-    <w:p>
-      <w:pPr>
-        <w:pStyle w:val="Paragraphedeliste"/>
-        <w:numPr>
-          <w:ilvl w:val="2"/>
-          <w:numId w:val="40"/>
-        </w:numPr>
-        <w:spacing w:before="0" w:after="160" w:line="259" w:lineRule="auto"/>
-      </w:pPr>
-      <w:r>
-        <w:rPr>
-          <w:rStyle w:val="CodeCar"/>
-          <w:rFonts w:asciiTheme="minorHAnsi" w:eastAsiaTheme="minorEastAsia" w:hAnsiTheme="minorHAnsi"/>
-          <w:noProof w:val="0"/>
-          <w:sz w:val="20"/>
-          <w:szCs w:val="20"/>
-        </w:rPr>
         <w:t xml:space="preserve">Créer un fichier texte </w:t>
       </w:r>
       <w:r>
@@ -2243,22 +3238,19 @@
         <w:t>d138.txt</w:t>
       </w:r>
       <w:r>
+        <w:t xml:space="preserve"> et copier-coller la configuration</w:t>
+      </w:r>
+      <w:r>
         <w:t xml:space="preserve"> </w:t>
       </w:r>
-      <w:r>
-        <w:t>et copier-coller la configuration</w:t>
-      </w:r>
-      <w:r>
-        <w:t xml:space="preserve"> </w:t>
-      </w:r>
     </w:p>
     <w:sectPr>
-      <w:headerReference w:type="even" r:id="rId11"/>
-      <w:headerReference w:type="default" r:id="rId12"/>
-      <w:footerReference w:type="even" r:id="rId13"/>
-      <w:footerReference w:type="default" r:id="rId14"/>
-      <w:headerReference w:type="first" r:id="rId15"/>
-      <w:footerReference w:type="first" r:id="rId16"/>
+      <w:headerReference w:type="even" r:id="rId32"/>
+      <w:headerReference w:type="default" r:id="rId33"/>
+      <w:footerReference w:type="even" r:id="rId34"/>
+      <w:footerReference w:type="default" r:id="rId35"/>
+      <w:headerReference w:type="first" r:id="rId36"/>
+      <w:footerReference w:type="first" r:id="rId37"/>
       <w:pgSz w:w="12240" w:h="15840"/>
       <w:pgMar w:top="1440" w:right="1440" w:bottom="1440" w:left="1440" w:header="720" w:footer="720" w:gutter="0"/>
       <w:cols w:space="720"/>
@@ -5905,6 +6897,7 @@
   <w:style w:type="character" w:default="1" w:styleId="Policepardfaut">
     <w:name w:val="Default Paragraph Font"/>
     <w:uiPriority w:val="1"/>
+    <w:semiHidden/>
     <w:unhideWhenUsed/>
   </w:style>
   <w:style w:type="table" w:default="1" w:styleId="TableauNormal">
@@ -7107,26 +8100,10 @@
 </file>
 
 <file path=customXml/item1.xml><?xml version="1.0" encoding="utf-8"?>
-<p:properties xmlns:p="http://schemas.microsoft.com/office/2006/metadata/properties" xmlns:xsi="http://www.w3.org/2001/XMLSchema-instance" xmlns:pc="http://schemas.microsoft.com/office/infopath/2007/PartnerControls">
-  <documentManagement>
-    <lcf76f155ced4ddcb4097134ff3c332f xmlns="3c67b34e-3a70-4c82-a88a-c9ff4020302e">
-      <Terms xmlns="http://schemas.microsoft.com/office/infopath/2007/PartnerControls"/>
-    </lcf76f155ced4ddcb4097134ff3c332f>
-    <TaxCatchAll xmlns="b34e80cf-1934-4719-b55f-e2e975c926d7" xsi:nil="true"/>
-  </documentManagement>
-</p:properties>
+<b:Sources xmlns:b="http://schemas.openxmlformats.org/officeDocument/2006/bibliography" xmlns="http://schemas.openxmlformats.org/officeDocument/2006/bibliography" SelectedStyle="\APASixthEditionOfficeOnline.xsl" StyleName="APA" Version="6"/>
 </file>
 
 <file path=customXml/item2.xml><?xml version="1.0" encoding="utf-8"?>
-<?mso-contentType ?>
-<FormTemplates xmlns="http://schemas.microsoft.com/sharepoint/v3/contenttype/forms">
-  <Display>DocumentLibraryForm</Display>
-  <Edit>DocumentLibraryForm</Edit>
-  <New>DocumentLibraryForm</New>
-</FormTemplates>
-</file>
-
-<file path=customXml/item3.xml><?xml version="1.0" encoding="utf-8"?>
 <ct:contentTypeSchema xmlns:ct="http://schemas.microsoft.com/office/2006/metadata/contentType" xmlns:ma="http://schemas.microsoft.com/office/2006/metadata/properties/metaAttributes" ct:_="" ma:_="" ma:contentTypeName="Document" ma:contentTypeID="0x010100B6EB6CCE8CCD4E4DB985DB752124FB64" ma:contentTypeVersion="10" ma:contentTypeDescription="Crée un document." ma:contentTypeScope="" ma:versionID="b659a35cc065ce33eb26c369abf814fa">
   <xsd:schema xmlns:xsd="http://www.w3.org/2001/XMLSchema" xmlns:xs="http://www.w3.org/2001/XMLSchema" xmlns:p="http://schemas.microsoft.com/office/2006/metadata/properties" xmlns:ns2="3c67b34e-3a70-4c82-a88a-c9ff4020302e" xmlns:ns3="b34e80cf-1934-4719-b55f-e2e975c926d7" targetNamespace="http://schemas.microsoft.com/office/2006/metadata/properties" ma:root="true" ma:fieldsID="c93dd5925414f1ca5912f8992d0a2fab" ns2:_="" ns3:_="">
     <xsd:import namespace="3c67b34e-3a70-4c82-a88a-c9ff4020302e"/>
@@ -7315,22 +8292,54 @@
 </ct:contentTypeSchema>
 </file>
 
+<file path=customXml/item3.xml><?xml version="1.0" encoding="utf-8"?>
+<?mso-contentType ?>
+<FormTemplates xmlns="http://schemas.microsoft.com/sharepoint/v3/contenttype/forms">
+  <Display>DocumentLibraryForm</Display>
+  <Edit>DocumentLibraryForm</Edit>
+  <New>DocumentLibraryForm</New>
+</FormTemplates>
+</file>
+
 <file path=customXml/item4.xml><?xml version="1.0" encoding="utf-8"?>
-<b:Sources xmlns:b="http://schemas.openxmlformats.org/officeDocument/2006/bibliography" xmlns="http://schemas.openxmlformats.org/officeDocument/2006/bibliography" SelectedStyle="\APASixthEditionOfficeOnline.xsl" StyleName="APA" Version="6"/>
+<p:properties xmlns:p="http://schemas.microsoft.com/office/2006/metadata/properties" xmlns:xsi="http://www.w3.org/2001/XMLSchema-instance" xmlns:pc="http://schemas.microsoft.com/office/infopath/2007/PartnerControls">
+  <documentManagement>
+    <lcf76f155ced4ddcb4097134ff3c332f xmlns="3c67b34e-3a70-4c82-a88a-c9ff4020302e">
+      <Terms xmlns="http://schemas.microsoft.com/office/infopath/2007/PartnerControls"/>
+    </lcf76f155ced4ddcb4097134ff3c332f>
+    <TaxCatchAll xmlns="b34e80cf-1934-4719-b55f-e2e975c926d7" xsi:nil="true"/>
+  </documentManagement>
+</p:properties>
 </file>
 
 <file path=customXml/itemProps1.xml><?xml version="1.0" encoding="utf-8"?>
-<ds:datastoreItem xmlns:ds="http://schemas.openxmlformats.org/officeDocument/2006/customXml" ds:itemID="{B1A0529D-107D-48F2-9C7A-C9B0532E61D6}">
+<ds:datastoreItem xmlns:ds="http://schemas.openxmlformats.org/officeDocument/2006/customXml" ds:itemID="{20730C14-5559-4816-8D2F-267CB32F4239}">
   <ds:schemaRefs>
-    <ds:schemaRef ds:uri="http://schemas.microsoft.com/office/2006/metadata/properties"/>
-    <ds:schemaRef ds:uri="http://schemas.microsoft.com/office/infopath/2007/PartnerControls"/>
-    <ds:schemaRef ds:uri="3e84a9ac-e9e7-4625-9617-3785fc32d9b9"/>
-    <ds:schemaRef ds:uri="c5d7612d-076e-434f-9d87-4cc920d82817"/>
+    <ds:schemaRef ds:uri="http://schemas.openxmlformats.org/officeDocument/2006/bibliography"/>
   </ds:schemaRefs>
 </ds:datastoreItem>
 </file>
 
 <file path=customXml/itemProps2.xml><?xml version="1.0" encoding="utf-8"?>
+<ds:datastoreItem xmlns:ds="http://schemas.openxmlformats.org/officeDocument/2006/customXml" ds:itemID="{F118890F-FC38-4984-9862-DA8F8EE43799}">
+  <ds:schemaRefs>
+    <ds:schemaRef ds:uri="http://schemas.microsoft.com/office/2006/metadata/contentType"/>
+    <ds:schemaRef ds:uri="http://schemas.microsoft.com/office/2006/metadata/properties/metaAttributes"/>
+    <ds:schemaRef ds:uri="http://www.w3.org/2001/XMLSchema"/>
+    <ds:schemaRef ds:uri="http://schemas.microsoft.com/office/2006/metadata/properties"/>
+    <ds:schemaRef ds:uri="3c67b34e-3a70-4c82-a88a-c9ff4020302e"/>
+    <ds:schemaRef ds:uri="b34e80cf-1934-4719-b55f-e2e975c926d7"/>
+    <ds:schemaRef ds:uri="http://schemas.microsoft.com/office/2006/documentManagement/types"/>
+    <ds:schemaRef ds:uri="http://schemas.microsoft.com/office/infopath/2007/PartnerControls"/>
+    <ds:schemaRef ds:uri="http://schemas.openxmlformats.org/package/2006/metadata/core-properties"/>
+    <ds:schemaRef ds:uri="http://purl.org/dc/elements/1.1/"/>
+    <ds:schemaRef ds:uri="http://purl.org/dc/terms/"/>
+    <ds:schemaRef ds:uri="http://schemas.microsoft.com/internal/obd"/>
+  </ds:schemaRefs>
+</ds:datastoreItem>
+</file>
+
+<file path=customXml/itemProps3.xml><?xml version="1.0" encoding="utf-8"?>
 <ds:datastoreItem xmlns:ds="http://schemas.openxmlformats.org/officeDocument/2006/customXml" ds:itemID="{5991A026-0A3A-4A40-9DFB-B1FAB829B1E8}">
   <ds:schemaRefs>
     <ds:schemaRef ds:uri="http://schemas.microsoft.com/sharepoint/v3/contenttype/forms"/>
@@ -7338,14 +8347,13 @@
 </ds:datastoreItem>
 </file>
 
-<file path=customXml/itemProps3.xml><?xml version="1.0" encoding="utf-8"?>
-<ds:datastoreItem xmlns:ds="http://schemas.openxmlformats.org/officeDocument/2006/customXml" ds:itemID="{F118890F-FC38-4984-9862-DA8F8EE43799}"/>
-</file>
-
 <file path=customXml/itemProps4.xml><?xml version="1.0" encoding="utf-8"?>
-<ds:datastoreItem xmlns:ds="http://schemas.openxmlformats.org/officeDocument/2006/customXml" ds:itemID="{20730C14-5559-4816-8D2F-267CB32F4239}">
+<ds:datastoreItem xmlns:ds="http://schemas.openxmlformats.org/officeDocument/2006/customXml" ds:itemID="{B1A0529D-107D-48F2-9C7A-C9B0532E61D6}">
   <ds:schemaRefs>
-    <ds:schemaRef ds:uri="http://schemas.openxmlformats.org/officeDocument/2006/bibliography"/>
+    <ds:schemaRef ds:uri="http://schemas.microsoft.com/office/2006/metadata/properties"/>
+    <ds:schemaRef ds:uri="http://schemas.microsoft.com/office/infopath/2007/PartnerControls"/>
+    <ds:schemaRef ds:uri="3c67b34e-3a70-4c82-a88a-c9ff4020302e"/>
+    <ds:schemaRef ds:uri="b34e80cf-1934-4719-b55f-e2e975c926d7"/>
   </ds:schemaRefs>
 </ds:datastoreItem>
 </file>
</xml_diff>

<commit_message>
Fin de l'exercice 13 en réseau
</commit_message>
<xml_diff>
--- a/RESEAU_LOCAL_ET_SECURITE/Cours13-CLI_SSH/420-2C5-JR_13_Exercice.docx
+++ b/RESEAU_LOCAL_ET_SECURITE/Cours13-CLI_SSH/420-2C5-JR_13_Exercice.docx
@@ -48,7 +48,15 @@
         <w:t>Créer un</w:t>
       </w:r>
       <w:r>
-        <w:t xml:space="preserve"> nouveau fichier Packet Tracer</w:t>
+        <w:t xml:space="preserve"> nouveau fichier </w:t>
+      </w:r>
+      <w:proofErr w:type="spellStart"/>
+      <w:r>
+        <w:t>Packet</w:t>
+      </w:r>
+      <w:proofErr w:type="spellEnd"/>
+      <w:r>
+        <w:t xml:space="preserve"> Tracer</w:t>
       </w:r>
       <w:r>
         <w:t xml:space="preserve"> </w:t>
@@ -272,6 +280,9 @@
         <w:spacing w:before="0" w:after="160" w:line="259" w:lineRule="auto"/>
       </w:pPr>
       <w:r>
+        <w:rPr>
+          <w:noProof/>
+        </w:rPr>
         <w:drawing>
           <wp:inline distT="0" distB="0" distL="0" distR="0" wp14:anchorId="56D93FC4" wp14:editId="677037C3">
             <wp:extent cx="4077269" cy="257211"/>
@@ -349,6 +360,9 @@
         <w:spacing w:before="0" w:after="160" w:line="259" w:lineRule="auto"/>
       </w:pPr>
       <w:r>
+        <w:rPr>
+          <w:noProof/>
+        </w:rPr>
         <w:drawing>
           <wp:inline distT="0" distB="0" distL="0" distR="0" wp14:anchorId="634830D2" wp14:editId="6385E0B2">
             <wp:extent cx="5839640" cy="571580"/>
@@ -437,7 +451,6 @@
           <w:rStyle w:val="CodeChar"/>
           <w:rFonts w:asciiTheme="minorHAnsi" w:eastAsiaTheme="minorEastAsia" w:hAnsiTheme="minorHAnsi" w:cstheme="minorBidi"/>
           <w:iCs w:val="0"/>
-          <w:noProof w:val="0"/>
         </w:rPr>
         <w:drawing>
           <wp:inline distT="0" distB="0" distL="0" distR="0" wp14:anchorId="738977F5" wp14:editId="0517E37B">
@@ -513,6 +526,9 @@
         <w:spacing w:before="0" w:after="160" w:line="259" w:lineRule="auto"/>
       </w:pPr>
       <w:r>
+        <w:rPr>
+          <w:noProof/>
+        </w:rPr>
         <w:drawing>
           <wp:inline distT="0" distB="0" distL="0" distR="0" wp14:anchorId="56A821A8" wp14:editId="0B201D0D">
             <wp:extent cx="3781953" cy="209579"/>
@@ -572,6 +588,9 @@
         <w:spacing w:before="0" w:after="160" w:line="259" w:lineRule="auto"/>
       </w:pPr>
       <w:r>
+        <w:rPr>
+          <w:noProof/>
+        </w:rPr>
         <w:drawing>
           <wp:inline distT="0" distB="0" distL="0" distR="0" wp14:anchorId="7E22E0C3" wp14:editId="1B158DF5">
             <wp:extent cx="1848108" cy="238158"/>
@@ -657,7 +676,6 @@
         <w:rPr>
           <w:rStyle w:val="CodeCar"/>
           <w:rFonts w:asciiTheme="minorHAnsi" w:eastAsiaTheme="minorEastAsia" w:hAnsiTheme="minorHAnsi"/>
-          <w:noProof w:val="0"/>
           <w:sz w:val="20"/>
           <w:szCs w:val="20"/>
         </w:rPr>
@@ -729,6 +747,9 @@
         <w:spacing w:before="0" w:after="160" w:line="259" w:lineRule="auto"/>
       </w:pPr>
       <w:r>
+        <w:rPr>
+          <w:noProof/>
+        </w:rPr>
         <w:drawing>
           <wp:inline distT="0" distB="0" distL="0" distR="0" wp14:anchorId="77DEA3B0" wp14:editId="333A9D0F">
             <wp:extent cx="4096322" cy="238158"/>
@@ -841,7 +862,6 @@
         <w:rPr>
           <w:rStyle w:val="CodeCar"/>
           <w:rFonts w:asciiTheme="minorHAnsi" w:eastAsiaTheme="minorEastAsia" w:hAnsiTheme="minorHAnsi"/>
-          <w:noProof w:val="0"/>
           <w:sz w:val="20"/>
           <w:szCs w:val="20"/>
         </w:rPr>
@@ -904,6 +924,9 @@
         <w:spacing w:before="0" w:after="160" w:line="259" w:lineRule="auto"/>
       </w:pPr>
       <w:r>
+        <w:rPr>
+          <w:noProof/>
+        </w:rPr>
         <w:drawing>
           <wp:inline distT="0" distB="0" distL="0" distR="0" wp14:anchorId="7A37A9C2" wp14:editId="0A80256C">
             <wp:extent cx="5943600" cy="347980"/>
@@ -947,6 +970,9 @@
         <w:spacing w:before="0" w:after="160" w:line="259" w:lineRule="auto"/>
       </w:pPr>
       <w:r>
+        <w:rPr>
+          <w:noProof/>
+        </w:rPr>
         <w:drawing>
           <wp:inline distT="0" distB="0" distL="0" distR="0" wp14:anchorId="282196F3" wp14:editId="2BA89E9A">
             <wp:extent cx="3429479" cy="257211"/>
@@ -1006,6 +1032,9 @@
         <w:spacing w:before="0" w:after="160" w:line="259" w:lineRule="auto"/>
       </w:pPr>
       <w:r>
+        <w:rPr>
+          <w:noProof/>
+        </w:rPr>
         <w:drawing>
           <wp:inline distT="0" distB="0" distL="0" distR="0" wp14:anchorId="157527EA" wp14:editId="4A890B6E">
             <wp:extent cx="1790950" cy="276264"/>
@@ -1091,6 +1120,9 @@
         <w:ind w:left="1440"/>
       </w:pPr>
       <w:r>
+        <w:rPr>
+          <w:noProof/>
+        </w:rPr>
         <w:lastRenderedPageBreak/>
         <w:drawing>
           <wp:inline distT="0" distB="0" distL="0" distR="0" wp14:anchorId="3A4D4F14" wp14:editId="156C4BF2">
@@ -1180,6 +1212,9 @@
         <w:ind w:left="1440"/>
       </w:pPr>
       <w:r>
+        <w:rPr>
+          <w:noProof/>
+        </w:rPr>
         <w:drawing>
           <wp:inline distT="0" distB="0" distL="0" distR="0" wp14:anchorId="3EBDDEBA" wp14:editId="151648A2">
             <wp:extent cx="4486901" cy="266737"/>
@@ -1267,6 +1302,9 @@
         <w:ind w:left="1440"/>
       </w:pPr>
       <w:r>
+        <w:rPr>
+          <w:noProof/>
+        </w:rPr>
         <w:drawing>
           <wp:inline distT="0" distB="0" distL="0" distR="0" wp14:anchorId="231FA96B" wp14:editId="4044E9AE">
             <wp:extent cx="5943600" cy="1039495"/>
@@ -1311,6 +1349,9 @@
         <w:ind w:left="1440"/>
       </w:pPr>
       <w:r>
+        <w:rPr>
+          <w:noProof/>
+        </w:rPr>
         <w:drawing>
           <wp:inline distT="0" distB="0" distL="0" distR="0" wp14:anchorId="687DD615" wp14:editId="0898748A">
             <wp:extent cx="5943600" cy="2966720"/>
@@ -1402,7 +1443,6 @@
         <w:rPr>
           <w:rStyle w:val="CodeCar"/>
           <w:rFonts w:asciiTheme="minorHAnsi" w:eastAsiaTheme="minorEastAsia" w:hAnsiTheme="minorHAnsi"/>
-          <w:noProof w:val="0"/>
           <w:sz w:val="20"/>
           <w:szCs w:val="20"/>
         </w:rPr>
@@ -1466,6 +1506,9 @@
         <w:ind w:left="1440"/>
       </w:pPr>
       <w:r>
+        <w:rPr>
+          <w:noProof/>
+        </w:rPr>
         <w:drawing>
           <wp:inline distT="0" distB="0" distL="0" distR="0" wp14:anchorId="0681360D" wp14:editId="26033F1B">
             <wp:extent cx="5430008" cy="266737"/>
@@ -1523,6 +1566,9 @@
         <w:ind w:left="1440"/>
       </w:pPr>
       <w:r>
+        <w:rPr>
+          <w:noProof/>
+        </w:rPr>
         <w:drawing>
           <wp:inline distT="0" distB="0" distL="0" distR="0" wp14:anchorId="46322119" wp14:editId="0C2C98D9">
             <wp:extent cx="3648584" cy="238158"/>
@@ -1862,7 +1908,6 @@
         <w:rPr>
           <w:rStyle w:val="CodeCar"/>
           <w:rFonts w:asciiTheme="minorHAnsi" w:eastAsiaTheme="minorEastAsia" w:hAnsiTheme="minorHAnsi"/>
-          <w:noProof w:val="0"/>
           <w:sz w:val="20"/>
           <w:szCs w:val="20"/>
         </w:rPr>
@@ -2010,7 +2055,6 @@
         <w:rPr>
           <w:rStyle w:val="CodeCar"/>
           <w:rFonts w:asciiTheme="minorHAnsi" w:eastAsiaTheme="minorEastAsia" w:hAnsiTheme="minorHAnsi"/>
-          <w:noProof w:val="0"/>
           <w:sz w:val="20"/>
           <w:szCs w:val="20"/>
         </w:rPr>
@@ -2125,7 +2169,6 @@
         <w:rPr>
           <w:rStyle w:val="CodeCar"/>
           <w:rFonts w:asciiTheme="minorHAnsi" w:eastAsiaTheme="minorEastAsia" w:hAnsiTheme="minorHAnsi"/>
-          <w:noProof w:val="0"/>
           <w:sz w:val="20"/>
           <w:szCs w:val="20"/>
         </w:rPr>
@@ -2271,6 +2314,49 @@
     <w:p>
       <w:pPr>
         <w:pStyle w:val="Paragraphedeliste"/>
+        <w:spacing w:before="0" w:after="160" w:line="259" w:lineRule="auto"/>
+      </w:pPr>
+      <w:r>
+        <w:drawing>
+          <wp:inline distT="0" distB="0" distL="0" distR="0" wp14:anchorId="22FCFC15" wp14:editId="2BE1829F">
+            <wp:extent cx="5943600" cy="895985"/>
+            <wp:effectExtent l="0" t="0" r="0" b="0"/>
+            <wp:docPr id="532146621" name="Image 1"/>
+            <wp:cNvGraphicFramePr>
+              <a:graphicFrameLocks xmlns:a="http://schemas.openxmlformats.org/drawingml/2006/main" noChangeAspect="1"/>
+            </wp:cNvGraphicFramePr>
+            <a:graphic xmlns:a="http://schemas.openxmlformats.org/drawingml/2006/main">
+              <a:graphicData uri="http://schemas.openxmlformats.org/drawingml/2006/picture">
+                <pic:pic xmlns:pic="http://schemas.openxmlformats.org/drawingml/2006/picture">
+                  <pic:nvPicPr>
+                    <pic:cNvPr id="532146621" name=""/>
+                    <pic:cNvPicPr/>
+                  </pic:nvPicPr>
+                  <pic:blipFill>
+                    <a:blip r:embed="rId32"/>
+                    <a:stretch>
+                      <a:fillRect/>
+                    </a:stretch>
+                  </pic:blipFill>
+                  <pic:spPr>
+                    <a:xfrm>
+                      <a:off x="0" y="0"/>
+                      <a:ext cx="5943600" cy="895985"/>
+                    </a:xfrm>
+                    <a:prstGeom prst="rect">
+                      <a:avLst/>
+                    </a:prstGeom>
+                  </pic:spPr>
+                </pic:pic>
+              </a:graphicData>
+            </a:graphic>
+          </wp:inline>
+        </w:drawing>
+      </w:r>
+    </w:p>
+    <w:p>
+      <w:pPr>
+        <w:pStyle w:val="Paragraphedeliste"/>
         <w:numPr>
           <w:ilvl w:val="0"/>
           <w:numId w:val="38"/>
@@ -2356,6 +2442,94 @@
     <w:p>
       <w:pPr>
         <w:pStyle w:val="Paragraphedeliste"/>
+        <w:spacing w:before="0" w:after="160" w:line="259" w:lineRule="auto"/>
+        <w:ind w:left="1440"/>
+      </w:pPr>
+      <w:r>
+        <w:drawing>
+          <wp:inline distT="0" distB="0" distL="0" distR="0" wp14:anchorId="17DCA4CD" wp14:editId="06AB1216">
+            <wp:extent cx="5725324" cy="1057423"/>
+            <wp:effectExtent l="0" t="0" r="0" b="9525"/>
+            <wp:docPr id="1528605156" name="Image 1"/>
+            <wp:cNvGraphicFramePr>
+              <a:graphicFrameLocks xmlns:a="http://schemas.openxmlformats.org/drawingml/2006/main" noChangeAspect="1"/>
+            </wp:cNvGraphicFramePr>
+            <a:graphic xmlns:a="http://schemas.openxmlformats.org/drawingml/2006/main">
+              <a:graphicData uri="http://schemas.openxmlformats.org/drawingml/2006/picture">
+                <pic:pic xmlns:pic="http://schemas.openxmlformats.org/drawingml/2006/picture">
+                  <pic:nvPicPr>
+                    <pic:cNvPr id="1528605156" name=""/>
+                    <pic:cNvPicPr/>
+                  </pic:nvPicPr>
+                  <pic:blipFill>
+                    <a:blip r:embed="rId33"/>
+                    <a:stretch>
+                      <a:fillRect/>
+                    </a:stretch>
+                  </pic:blipFill>
+                  <pic:spPr>
+                    <a:xfrm>
+                      <a:off x="0" y="0"/>
+                      <a:ext cx="5725324" cy="1057423"/>
+                    </a:xfrm>
+                    <a:prstGeom prst="rect">
+                      <a:avLst/>
+                    </a:prstGeom>
+                  </pic:spPr>
+                </pic:pic>
+              </a:graphicData>
+            </a:graphic>
+          </wp:inline>
+        </w:drawing>
+      </w:r>
+    </w:p>
+    <w:p>
+      <w:pPr>
+        <w:pStyle w:val="Paragraphedeliste"/>
+        <w:spacing w:before="0" w:after="160" w:line="259" w:lineRule="auto"/>
+        <w:ind w:left="1440"/>
+      </w:pPr>
+      <w:r>
+        <w:drawing>
+          <wp:inline distT="0" distB="0" distL="0" distR="0" wp14:anchorId="7C225BB2" wp14:editId="1D7772C6">
+            <wp:extent cx="5943600" cy="177800"/>
+            <wp:effectExtent l="0" t="0" r="0" b="0"/>
+            <wp:docPr id="459423717" name="Image 1"/>
+            <wp:cNvGraphicFramePr>
+              <a:graphicFrameLocks xmlns:a="http://schemas.openxmlformats.org/drawingml/2006/main" noChangeAspect="1"/>
+            </wp:cNvGraphicFramePr>
+            <a:graphic xmlns:a="http://schemas.openxmlformats.org/drawingml/2006/main">
+              <a:graphicData uri="http://schemas.openxmlformats.org/drawingml/2006/picture">
+                <pic:pic xmlns:pic="http://schemas.openxmlformats.org/drawingml/2006/picture">
+                  <pic:nvPicPr>
+                    <pic:cNvPr id="459423717" name=""/>
+                    <pic:cNvPicPr/>
+                  </pic:nvPicPr>
+                  <pic:blipFill>
+                    <a:blip r:embed="rId34"/>
+                    <a:stretch>
+                      <a:fillRect/>
+                    </a:stretch>
+                  </pic:blipFill>
+                  <pic:spPr>
+                    <a:xfrm>
+                      <a:off x="0" y="0"/>
+                      <a:ext cx="5943600" cy="177800"/>
+                    </a:xfrm>
+                    <a:prstGeom prst="rect">
+                      <a:avLst/>
+                    </a:prstGeom>
+                  </pic:spPr>
+                </pic:pic>
+              </a:graphicData>
+            </a:graphic>
+          </wp:inline>
+        </w:drawing>
+      </w:r>
+    </w:p>
+    <w:p>
+      <w:pPr>
+        <w:pStyle w:val="Paragraphedeliste"/>
         <w:numPr>
           <w:ilvl w:val="1"/>
           <w:numId w:val="38"/>
@@ -2440,6 +2614,50 @@
     <w:p>
       <w:pPr>
         <w:pStyle w:val="Paragraphedeliste"/>
+        <w:spacing w:before="0" w:after="160" w:line="259" w:lineRule="auto"/>
+        <w:ind w:left="2160"/>
+      </w:pPr>
+      <w:r>
+        <w:drawing>
+          <wp:inline distT="0" distB="0" distL="0" distR="0" wp14:anchorId="2D6EA855" wp14:editId="093C92BC">
+            <wp:extent cx="5410955" cy="419158"/>
+            <wp:effectExtent l="0" t="0" r="0" b="0"/>
+            <wp:docPr id="361625811" name="Image 1"/>
+            <wp:cNvGraphicFramePr>
+              <a:graphicFrameLocks xmlns:a="http://schemas.openxmlformats.org/drawingml/2006/main" noChangeAspect="1"/>
+            </wp:cNvGraphicFramePr>
+            <a:graphic xmlns:a="http://schemas.openxmlformats.org/drawingml/2006/main">
+              <a:graphicData uri="http://schemas.openxmlformats.org/drawingml/2006/picture">
+                <pic:pic xmlns:pic="http://schemas.openxmlformats.org/drawingml/2006/picture">
+                  <pic:nvPicPr>
+                    <pic:cNvPr id="361625811" name=""/>
+                    <pic:cNvPicPr/>
+                  </pic:nvPicPr>
+                  <pic:blipFill>
+                    <a:blip r:embed="rId35"/>
+                    <a:stretch>
+                      <a:fillRect/>
+                    </a:stretch>
+                  </pic:blipFill>
+                  <pic:spPr>
+                    <a:xfrm>
+                      <a:off x="0" y="0"/>
+                      <a:ext cx="5410955" cy="419158"/>
+                    </a:xfrm>
+                    <a:prstGeom prst="rect">
+                      <a:avLst/>
+                    </a:prstGeom>
+                  </pic:spPr>
+                </pic:pic>
+              </a:graphicData>
+            </a:graphic>
+          </wp:inline>
+        </w:drawing>
+      </w:r>
+    </w:p>
+    <w:p>
+      <w:pPr>
+        <w:pStyle w:val="Paragraphedeliste"/>
         <w:numPr>
           <w:ilvl w:val="2"/>
           <w:numId w:val="38"/>
@@ -2481,6 +2699,50 @@
     <w:p>
       <w:pPr>
         <w:pStyle w:val="Paragraphedeliste"/>
+        <w:spacing w:before="0" w:after="160" w:line="259" w:lineRule="auto"/>
+        <w:ind w:left="2160"/>
+      </w:pPr>
+      <w:r>
+        <w:drawing>
+          <wp:inline distT="0" distB="0" distL="0" distR="0" wp14:anchorId="35793E9B" wp14:editId="07638073">
+            <wp:extent cx="4124901" cy="276264"/>
+            <wp:effectExtent l="0" t="0" r="0" b="9525"/>
+            <wp:docPr id="1756793983" name="Image 1"/>
+            <wp:cNvGraphicFramePr>
+              <a:graphicFrameLocks xmlns:a="http://schemas.openxmlformats.org/drawingml/2006/main" noChangeAspect="1"/>
+            </wp:cNvGraphicFramePr>
+            <a:graphic xmlns:a="http://schemas.openxmlformats.org/drawingml/2006/main">
+              <a:graphicData uri="http://schemas.openxmlformats.org/drawingml/2006/picture">
+                <pic:pic xmlns:pic="http://schemas.openxmlformats.org/drawingml/2006/picture">
+                  <pic:nvPicPr>
+                    <pic:cNvPr id="1756793983" name=""/>
+                    <pic:cNvPicPr/>
+                  </pic:nvPicPr>
+                  <pic:blipFill>
+                    <a:blip r:embed="rId36"/>
+                    <a:stretch>
+                      <a:fillRect/>
+                    </a:stretch>
+                  </pic:blipFill>
+                  <pic:spPr>
+                    <a:xfrm>
+                      <a:off x="0" y="0"/>
+                      <a:ext cx="4124901" cy="276264"/>
+                    </a:xfrm>
+                    <a:prstGeom prst="rect">
+                      <a:avLst/>
+                    </a:prstGeom>
+                  </pic:spPr>
+                </pic:pic>
+              </a:graphicData>
+            </a:graphic>
+          </wp:inline>
+        </w:drawing>
+      </w:r>
+    </w:p>
+    <w:p>
+      <w:pPr>
+        <w:pStyle w:val="Paragraphedeliste"/>
         <w:numPr>
           <w:ilvl w:val="2"/>
           <w:numId w:val="38"/>
@@ -2503,6 +2765,72 @@
     <w:p>
       <w:pPr>
         <w:pStyle w:val="Paragraphedeliste"/>
+        <w:spacing w:before="0" w:after="160" w:line="259" w:lineRule="auto"/>
+        <w:ind w:left="2160"/>
+        <w:rPr>
+          <w:rFonts w:ascii="Courier New" w:eastAsiaTheme="minorHAnsi" w:hAnsi="Courier New" w:cs="Courier New"/>
+          <w:noProof/>
+          <w:sz w:val="22"/>
+          <w:szCs w:val="22"/>
+        </w:rPr>
+      </w:pPr>
+      <w:r>
+        <w:rPr>
+          <w:rFonts w:ascii="Courier New" w:eastAsiaTheme="minorHAnsi" w:hAnsi="Courier New" w:cs="Courier New"/>
+          <w:noProof/>
+          <w:sz w:val="22"/>
+          <w:szCs w:val="22"/>
+        </w:rPr>
+        <w:drawing>
+          <wp:inline distT="0" distB="0" distL="0" distR="0" wp14:anchorId="295B8054" wp14:editId="096A78B1">
+            <wp:extent cx="2057400" cy="247650"/>
+            <wp:effectExtent l="0" t="0" r="0" b="0"/>
+            <wp:docPr id="1056798858" name="Image 1"/>
+            <wp:cNvGraphicFramePr>
+              <a:graphicFrameLocks xmlns:a="http://schemas.openxmlformats.org/drawingml/2006/main" noChangeAspect="1"/>
+            </wp:cNvGraphicFramePr>
+            <a:graphic xmlns:a="http://schemas.openxmlformats.org/drawingml/2006/main">
+              <a:graphicData uri="http://schemas.openxmlformats.org/drawingml/2006/picture">
+                <pic:pic xmlns:pic="http://schemas.openxmlformats.org/drawingml/2006/picture">
+                  <pic:nvPicPr>
+                    <pic:cNvPr id="0" name="Picture 2"/>
+                    <pic:cNvPicPr>
+                      <a:picLocks noChangeAspect="1" noChangeArrowheads="1"/>
+                    </pic:cNvPicPr>
+                  </pic:nvPicPr>
+                  <pic:blipFill>
+                    <a:blip r:embed="rId37">
+                      <a:extLst>
+                        <a:ext uri="{28A0092B-C50C-407E-A947-70E740481C1C}">
+                          <a14:useLocalDpi xmlns:a14="http://schemas.microsoft.com/office/drawing/2010/main" val="0"/>
+                        </a:ext>
+                      </a:extLst>
+                    </a:blip>
+                    <a:srcRect/>
+                    <a:stretch>
+                      <a:fillRect/>
+                    </a:stretch>
+                  </pic:blipFill>
+                  <pic:spPr bwMode="auto">
+                    <a:xfrm>
+                      <a:off x="0" y="0"/>
+                      <a:ext cx="2057400" cy="247650"/>
+                    </a:xfrm>
+                    <a:prstGeom prst="rect">
+                      <a:avLst/>
+                    </a:prstGeom>
+                    <a:noFill/>
+                  </pic:spPr>
+                </pic:pic>
+              </a:graphicData>
+            </a:graphic>
+          </wp:inline>
+        </w:drawing>
+      </w:r>
+    </w:p>
+    <w:p>
+      <w:pPr>
+        <w:pStyle w:val="Paragraphedeliste"/>
         <w:numPr>
           <w:ilvl w:val="1"/>
           <w:numId w:val="38"/>
@@ -2519,11 +2847,71 @@
     <w:p>
       <w:pPr>
         <w:pStyle w:val="Paragraphedeliste"/>
+        <w:spacing w:before="0" w:after="160" w:line="259" w:lineRule="auto"/>
+        <w:ind w:left="1440"/>
+      </w:pPr>
+      <w:r>
+        <w:drawing>
+          <wp:inline distT="0" distB="0" distL="0" distR="0" wp14:anchorId="3616AC40" wp14:editId="1EDAE2E7">
+            <wp:extent cx="4105848" cy="219106"/>
+            <wp:effectExtent l="0" t="0" r="0" b="9525"/>
+            <wp:docPr id="1535198754" name="Image 1"/>
+            <wp:cNvGraphicFramePr>
+              <a:graphicFrameLocks xmlns:a="http://schemas.openxmlformats.org/drawingml/2006/main" noChangeAspect="1"/>
+            </wp:cNvGraphicFramePr>
+            <a:graphic xmlns:a="http://schemas.openxmlformats.org/drawingml/2006/main">
+              <a:graphicData uri="http://schemas.openxmlformats.org/drawingml/2006/picture">
+                <pic:pic xmlns:pic="http://schemas.openxmlformats.org/drawingml/2006/picture">
+                  <pic:nvPicPr>
+                    <pic:cNvPr id="1535198754" name=""/>
+                    <pic:cNvPicPr/>
+                  </pic:nvPicPr>
+                  <pic:blipFill>
+                    <a:blip r:embed="rId38"/>
+                    <a:stretch>
+                      <a:fillRect/>
+                    </a:stretch>
+                  </pic:blipFill>
+                  <pic:spPr>
+                    <a:xfrm>
+                      <a:off x="0" y="0"/>
+                      <a:ext cx="4105848" cy="219106"/>
+                    </a:xfrm>
+                    <a:prstGeom prst="rect">
+                      <a:avLst/>
+                    </a:prstGeom>
+                  </pic:spPr>
+                </pic:pic>
+              </a:graphicData>
+            </a:graphic>
+          </wp:inline>
+        </w:drawing>
+      </w:r>
+    </w:p>
+    <w:p>
+      <w:pPr>
+        <w:pStyle w:val="Paragraphedeliste"/>
         <w:numPr>
           <w:ilvl w:val="1"/>
           <w:numId w:val="38"/>
         </w:numPr>
         <w:spacing w:before="0" w:after="160" w:line="259" w:lineRule="auto"/>
+        <w:rPr>
+          <w:rFonts w:ascii="Courier New" w:eastAsiaTheme="minorHAnsi" w:hAnsi="Courier New" w:cs="Courier New"/>
+          <w:noProof/>
+          <w:sz w:val="22"/>
+          <w:szCs w:val="22"/>
+        </w:rPr>
+      </w:pPr>
+      <w:r>
+        <w:t>Enregistrer la configuration du routeur</w:t>
+      </w:r>
+    </w:p>
+    <w:p>
+      <w:pPr>
+        <w:pStyle w:val="Paragraphedeliste"/>
+        <w:spacing w:before="0" w:after="160" w:line="259" w:lineRule="auto"/>
+        <w:ind w:left="1440"/>
         <w:rPr>
           <w:rStyle w:val="CodeChar"/>
           <w:rFonts w:eastAsiaTheme="minorHAnsi"/>
@@ -2533,131 +2921,6 @@
         </w:rPr>
       </w:pPr>
       <w:r>
-        <w:t>Enregistrer la configuration du routeur</w:t>
-      </w:r>
-    </w:p>
-    <w:p>
-      <w:pPr>
-        <w:pStyle w:val="Paragraphedeliste"/>
-        <w:numPr>
-          <w:ilvl w:val="0"/>
-          <w:numId w:val="38"/>
-        </w:numPr>
-        <w:spacing w:before="0" w:after="160" w:line="259" w:lineRule="auto"/>
-        <w:rPr>
-          <w:rStyle w:val="CodeCar"/>
-          <w:rFonts w:asciiTheme="minorHAnsi" w:eastAsiaTheme="minorEastAsia" w:hAnsiTheme="minorHAnsi"/>
-          <w:noProof w:val="0"/>
-          <w:sz w:val="20"/>
-          <w:szCs w:val="20"/>
-        </w:rPr>
-      </w:pPr>
-      <w:r>
-        <w:t xml:space="preserve">Configurer </w:t>
-      </w:r>
-      <w:r>
-        <w:t>le</w:t>
-      </w:r>
-      <w:r>
-        <w:t xml:space="preserve"> port </w:t>
-      </w:r>
-      <w:r>
-        <w:rPr>
-          <w:rStyle w:val="CodeCar"/>
-        </w:rPr>
-        <w:t>GigabitEthernet 0/0/</w:t>
-      </w:r>
-      <w:r>
-        <w:rPr>
-          <w:rStyle w:val="CodeCar"/>
-        </w:rPr>
-        <w:t>1</w:t>
-      </w:r>
-    </w:p>
-    <w:p>
-      <w:pPr>
-        <w:pStyle w:val="Paragraphedeliste"/>
-        <w:numPr>
-          <w:ilvl w:val="1"/>
-          <w:numId w:val="38"/>
-        </w:numPr>
-        <w:spacing w:before="0" w:after="160" w:line="259" w:lineRule="auto"/>
-        <w:rPr>
-          <w:rStyle w:val="CodeCar"/>
-          <w:rFonts w:asciiTheme="minorHAnsi" w:eastAsiaTheme="minorEastAsia" w:hAnsiTheme="minorHAnsi"/>
-          <w:noProof w:val="0"/>
-          <w:sz w:val="20"/>
-          <w:szCs w:val="20"/>
-        </w:rPr>
-      </w:pPr>
-      <w:r>
-        <w:t>A</w:t>
-      </w:r>
-      <w:r>
-        <w:t>dresse</w:t>
-      </w:r>
-      <w:r>
-        <w:t xml:space="preserve"> IP</w:t>
-      </w:r>
-      <w:r>
-        <w:t xml:space="preserve"> </w:t>
-      </w:r>
-      <w:r>
-        <w:rPr>
-          <w:rStyle w:val="CodeCar"/>
-        </w:rPr>
-        <w:t>192.168.1</w:t>
-      </w:r>
-      <w:r>
-        <w:rPr>
-          <w:rStyle w:val="CodeCar"/>
-        </w:rPr>
-        <w:t>40</w:t>
-      </w:r>
-      <w:r>
-        <w:rPr>
-          <w:rStyle w:val="CodeCar"/>
-        </w:rPr>
-        <w:t>.1</w:t>
-      </w:r>
-    </w:p>
-    <w:p>
-      <w:pPr>
-        <w:pStyle w:val="Paragraphedeliste"/>
-        <w:numPr>
-          <w:ilvl w:val="1"/>
-          <w:numId w:val="38"/>
-        </w:numPr>
-        <w:spacing w:before="0" w:after="160" w:line="259" w:lineRule="auto"/>
-      </w:pPr>
-      <w:r>
-        <w:t>Activer le port</w:t>
-      </w:r>
-    </w:p>
-    <w:p>
-      <w:pPr>
-        <w:pStyle w:val="Paragraphedeliste"/>
-        <w:numPr>
-          <w:ilvl w:val="1"/>
-          <w:numId w:val="38"/>
-        </w:numPr>
-        <w:spacing w:before="0" w:after="160" w:line="259" w:lineRule="auto"/>
-      </w:pPr>
-      <w:r>
-        <w:t>Afficher la configuration actuelle du routeur</w:t>
-      </w:r>
-      <w:r>
-        <w:t xml:space="preserve"> et vérifier les configurations</w:t>
-      </w:r>
-    </w:p>
-    <w:p>
-      <w:pPr>
-        <w:pStyle w:val="Paragraphedeliste"/>
-        <w:numPr>
-          <w:ilvl w:val="1"/>
-          <w:numId w:val="38"/>
-        </w:numPr>
-        <w:spacing w:before="0" w:after="160" w:line="259" w:lineRule="auto"/>
         <w:rPr>
           <w:rStyle w:val="CodeChar"/>
           <w:rFonts w:eastAsiaTheme="minorHAnsi"/>
@@ -2665,9 +2928,51 @@
           <w:sz w:val="22"/>
           <w:szCs w:val="22"/>
         </w:rPr>
-      </w:pPr>
-      <w:r>
-        <w:t>Enregistrer la configuration du routeur</w:t>
+        <w:drawing>
+          <wp:inline distT="0" distB="0" distL="0" distR="0" wp14:anchorId="4822B743" wp14:editId="33E032B5">
+            <wp:extent cx="1733550" cy="247650"/>
+            <wp:effectExtent l="0" t="0" r="0" b="0"/>
+            <wp:docPr id="490226898" name="Image 2"/>
+            <wp:cNvGraphicFramePr>
+              <a:graphicFrameLocks xmlns:a="http://schemas.openxmlformats.org/drawingml/2006/main" noChangeAspect="1"/>
+            </wp:cNvGraphicFramePr>
+            <a:graphic xmlns:a="http://schemas.openxmlformats.org/drawingml/2006/main">
+              <a:graphicData uri="http://schemas.openxmlformats.org/drawingml/2006/picture">
+                <pic:pic xmlns:pic="http://schemas.openxmlformats.org/drawingml/2006/picture">
+                  <pic:nvPicPr>
+                    <pic:cNvPr id="0" name="Picture 3"/>
+                    <pic:cNvPicPr>
+                      <a:picLocks noChangeAspect="1" noChangeArrowheads="1"/>
+                    </pic:cNvPicPr>
+                  </pic:nvPicPr>
+                  <pic:blipFill>
+                    <a:blip r:embed="rId39">
+                      <a:extLst>
+                        <a:ext uri="{28A0092B-C50C-407E-A947-70E740481C1C}">
+                          <a14:useLocalDpi xmlns:a14="http://schemas.microsoft.com/office/drawing/2010/main" val="0"/>
+                        </a:ext>
+                      </a:extLst>
+                    </a:blip>
+                    <a:srcRect/>
+                    <a:stretch>
+                      <a:fillRect/>
+                    </a:stretch>
+                  </pic:blipFill>
+                  <pic:spPr bwMode="auto">
+                    <a:xfrm>
+                      <a:off x="0" y="0"/>
+                      <a:ext cx="1733550" cy="247650"/>
+                    </a:xfrm>
+                    <a:prstGeom prst="rect">
+                      <a:avLst/>
+                    </a:prstGeom>
+                    <a:noFill/>
+                  </pic:spPr>
+                </pic:pic>
+              </a:graphicData>
+            </a:graphic>
+          </wp:inline>
+        </w:drawing>
       </w:r>
     </w:p>
     <w:p>
@@ -2678,15 +2983,34 @@
           <w:numId w:val="38"/>
         </w:numPr>
         <w:spacing w:before="0" w:after="160" w:line="259" w:lineRule="auto"/>
-      </w:pPr>
-      <w:r>
-        <w:t xml:space="preserve">Configurer SSH </w:t>
-      </w:r>
-      <w:r>
-        <w:t xml:space="preserve">sur le routeur </w:t>
-      </w:r>
-      <w:r>
-        <w:t>avec la configuration suivante</w:t>
+        <w:rPr>
+          <w:rStyle w:val="CodeCar"/>
+          <w:rFonts w:asciiTheme="minorHAnsi" w:eastAsiaTheme="minorEastAsia" w:hAnsiTheme="minorHAnsi"/>
+          <w:noProof w:val="0"/>
+          <w:sz w:val="20"/>
+          <w:szCs w:val="20"/>
+        </w:rPr>
+      </w:pPr>
+      <w:r>
+        <w:t xml:space="preserve">Configurer </w:t>
+      </w:r>
+      <w:r>
+        <w:t>le</w:t>
+      </w:r>
+      <w:r>
+        <w:t xml:space="preserve"> port </w:t>
+      </w:r>
+      <w:r>
+        <w:rPr>
+          <w:rStyle w:val="CodeCar"/>
+        </w:rPr>
+        <w:t>GigabitEthernet 0/0/</w:t>
+      </w:r>
+      <w:r>
+        <w:rPr>
+          <w:rStyle w:val="CodeCar"/>
+        </w:rPr>
+        <w:t>1</w:t>
       </w:r>
     </w:p>
     <w:p>
@@ -2697,24 +3021,101 @@
           <w:numId w:val="38"/>
         </w:numPr>
         <w:spacing w:before="0" w:after="160" w:line="259" w:lineRule="auto"/>
-      </w:pPr>
-      <w:r>
-        <w:t xml:space="preserve">Créer un compte </w:t>
-      </w:r>
-      <w:r>
-        <w:rPr>
-          <w:rStyle w:val="CodeCar"/>
-        </w:rPr>
-        <w:t>cstj</w:t>
-      </w:r>
-      <w:r>
-        <w:t xml:space="preserve"> avec un mot de passe sécuritaire</w:t>
-      </w:r>
-      <w:r>
-        <w:t xml:space="preserve"> différent</w:t>
-      </w:r>
-      <w:r>
-        <w:t xml:space="preserve"> de la Switch</w:t>
+        <w:rPr>
+          <w:rStyle w:val="CodeCar"/>
+          <w:rFonts w:asciiTheme="minorHAnsi" w:eastAsiaTheme="minorEastAsia" w:hAnsiTheme="minorHAnsi"/>
+          <w:noProof w:val="0"/>
+          <w:sz w:val="20"/>
+          <w:szCs w:val="20"/>
+        </w:rPr>
+      </w:pPr>
+      <w:r>
+        <w:t>A</w:t>
+      </w:r>
+      <w:r>
+        <w:t>dresse</w:t>
+      </w:r>
+      <w:r>
+        <w:t xml:space="preserve"> IP</w:t>
+      </w:r>
+      <w:r>
+        <w:t xml:space="preserve"> </w:t>
+      </w:r>
+      <w:r>
+        <w:rPr>
+          <w:rStyle w:val="CodeCar"/>
+        </w:rPr>
+        <w:t>192.168.1</w:t>
+      </w:r>
+      <w:r>
+        <w:rPr>
+          <w:rStyle w:val="CodeCar"/>
+        </w:rPr>
+        <w:t>40</w:t>
+      </w:r>
+      <w:r>
+        <w:rPr>
+          <w:rStyle w:val="CodeCar"/>
+        </w:rPr>
+        <w:t>.1</w:t>
+      </w:r>
+    </w:p>
+    <w:p>
+      <w:pPr>
+        <w:pStyle w:val="Paragraphedeliste"/>
+        <w:spacing w:before="0" w:after="160" w:line="259" w:lineRule="auto"/>
+        <w:ind w:left="1440"/>
+        <w:rPr>
+          <w:rStyle w:val="CodeCar"/>
+          <w:rFonts w:asciiTheme="minorHAnsi" w:eastAsiaTheme="minorEastAsia" w:hAnsiTheme="minorHAnsi"/>
+          <w:noProof w:val="0"/>
+          <w:sz w:val="20"/>
+          <w:szCs w:val="20"/>
+        </w:rPr>
+      </w:pPr>
+      <w:r>
+        <w:rPr>
+          <w:rStyle w:val="CodeCar"/>
+          <w:rFonts w:asciiTheme="minorHAnsi" w:eastAsiaTheme="minorEastAsia" w:hAnsiTheme="minorHAnsi"/>
+          <w:noProof w:val="0"/>
+          <w:sz w:val="20"/>
+          <w:szCs w:val="20"/>
+        </w:rPr>
+        <w:drawing>
+          <wp:inline distT="0" distB="0" distL="0" distR="0" wp14:anchorId="39755507" wp14:editId="654BC8E1">
+            <wp:extent cx="5630061" cy="228632"/>
+            <wp:effectExtent l="0" t="0" r="0" b="0"/>
+            <wp:docPr id="877998885" name="Image 1"/>
+            <wp:cNvGraphicFramePr>
+              <a:graphicFrameLocks xmlns:a="http://schemas.openxmlformats.org/drawingml/2006/main" noChangeAspect="1"/>
+            </wp:cNvGraphicFramePr>
+            <a:graphic xmlns:a="http://schemas.openxmlformats.org/drawingml/2006/main">
+              <a:graphicData uri="http://schemas.openxmlformats.org/drawingml/2006/picture">
+                <pic:pic xmlns:pic="http://schemas.openxmlformats.org/drawingml/2006/picture">
+                  <pic:nvPicPr>
+                    <pic:cNvPr id="877998885" name=""/>
+                    <pic:cNvPicPr/>
+                  </pic:nvPicPr>
+                  <pic:blipFill>
+                    <a:blip r:embed="rId40"/>
+                    <a:stretch>
+                      <a:fillRect/>
+                    </a:stretch>
+                  </pic:blipFill>
+                  <pic:spPr>
+                    <a:xfrm>
+                      <a:off x="0" y="0"/>
+                      <a:ext cx="5630061" cy="228632"/>
+                    </a:xfrm>
+                    <a:prstGeom prst="rect">
+                      <a:avLst/>
+                    </a:prstGeom>
+                  </pic:spPr>
+                </pic:pic>
+              </a:graphicData>
+            </a:graphic>
+          </wp:inline>
+        </w:drawing>
       </w:r>
     </w:p>
     <w:p>
@@ -2727,25 +3128,51 @@
         <w:spacing w:before="0" w:after="160" w:line="259" w:lineRule="auto"/>
       </w:pPr>
       <w:r>
-        <w:t xml:space="preserve">Nommer le routeur </w:t>
-      </w:r>
-      <w:r>
-        <w:rPr>
-          <w:rStyle w:val="CodeCar"/>
-        </w:rPr>
-        <w:t>router</w:t>
-      </w:r>
-      <w:r>
-        <w:rPr>
-          <w:rStyle w:val="CodeCar"/>
-        </w:rPr>
-        <w:t>-</w:t>
-      </w:r>
-      <w:r>
-        <w:rPr>
-          <w:rStyle w:val="CodeCar"/>
-        </w:rPr>
-        <w:t>d138</w:t>
+        <w:t>Activer le port</w:t>
+      </w:r>
+    </w:p>
+    <w:p>
+      <w:pPr>
+        <w:pStyle w:val="Paragraphedeliste"/>
+        <w:spacing w:before="0" w:after="160" w:line="259" w:lineRule="auto"/>
+        <w:ind w:left="1440"/>
+      </w:pPr>
+      <w:r>
+        <w:drawing>
+          <wp:inline distT="0" distB="0" distL="0" distR="0" wp14:anchorId="572D0C27" wp14:editId="763824DB">
+            <wp:extent cx="3296110" cy="266737"/>
+            <wp:effectExtent l="0" t="0" r="0" b="0"/>
+            <wp:docPr id="1414387775" name="Image 1"/>
+            <wp:cNvGraphicFramePr>
+              <a:graphicFrameLocks xmlns:a="http://schemas.openxmlformats.org/drawingml/2006/main" noChangeAspect="1"/>
+            </wp:cNvGraphicFramePr>
+            <a:graphic xmlns:a="http://schemas.openxmlformats.org/drawingml/2006/main">
+              <a:graphicData uri="http://schemas.openxmlformats.org/drawingml/2006/picture">
+                <pic:pic xmlns:pic="http://schemas.openxmlformats.org/drawingml/2006/picture">
+                  <pic:nvPicPr>
+                    <pic:cNvPr id="1414387775" name=""/>
+                    <pic:cNvPicPr/>
+                  </pic:nvPicPr>
+                  <pic:blipFill>
+                    <a:blip r:embed="rId41"/>
+                    <a:stretch>
+                      <a:fillRect/>
+                    </a:stretch>
+                  </pic:blipFill>
+                  <pic:spPr>
+                    <a:xfrm>
+                      <a:off x="0" y="0"/>
+                      <a:ext cx="3296110" cy="266737"/>
+                    </a:xfrm>
+                    <a:prstGeom prst="rect">
+                      <a:avLst/>
+                    </a:prstGeom>
+                  </pic:spPr>
+                </pic:pic>
+              </a:graphicData>
+            </a:graphic>
+          </wp:inline>
+        </w:drawing>
       </w:r>
     </w:p>
     <w:p>
@@ -2758,25 +3185,54 @@
         <w:spacing w:before="0" w:after="160" w:line="259" w:lineRule="auto"/>
       </w:pPr>
       <w:r>
-        <w:t xml:space="preserve">Configurer SSH avec un certificat d’encryption pour le domaine </w:t>
-      </w:r>
-      <w:r>
-        <w:rPr>
-          <w:rStyle w:val="CodeCar"/>
-        </w:rPr>
-        <w:t>cstj.qc.ca</w:t>
-      </w:r>
-      <w:r>
-        <w:t xml:space="preserve"> de </w:t>
-      </w:r>
-      <w:r>
-        <w:rPr>
-          <w:rStyle w:val="CodeCar"/>
-        </w:rPr>
-        <w:t>4096</w:t>
-      </w:r>
-      <w:r>
-        <w:t xml:space="preserve"> bis</w:t>
+        <w:t>Afficher la configuration actuelle du routeur</w:t>
+      </w:r>
+      <w:r>
+        <w:t xml:space="preserve"> et vérifier les configurations</w:t>
+      </w:r>
+    </w:p>
+    <w:p>
+      <w:pPr>
+        <w:pStyle w:val="Paragraphedeliste"/>
+        <w:spacing w:before="0" w:after="160" w:line="259" w:lineRule="auto"/>
+        <w:ind w:left="1440"/>
+      </w:pPr>
+      <w:r>
+        <w:drawing>
+          <wp:inline distT="0" distB="0" distL="0" distR="0" wp14:anchorId="2A014D11" wp14:editId="0EF65893">
+            <wp:extent cx="4344006" cy="219106"/>
+            <wp:effectExtent l="0" t="0" r="0" b="9525"/>
+            <wp:docPr id="475057832" name="Image 1"/>
+            <wp:cNvGraphicFramePr>
+              <a:graphicFrameLocks xmlns:a="http://schemas.openxmlformats.org/drawingml/2006/main" noChangeAspect="1"/>
+            </wp:cNvGraphicFramePr>
+            <a:graphic xmlns:a="http://schemas.openxmlformats.org/drawingml/2006/main">
+              <a:graphicData uri="http://schemas.openxmlformats.org/drawingml/2006/picture">
+                <pic:pic xmlns:pic="http://schemas.openxmlformats.org/drawingml/2006/picture">
+                  <pic:nvPicPr>
+                    <pic:cNvPr id="475057832" name=""/>
+                    <pic:cNvPicPr/>
+                  </pic:nvPicPr>
+                  <pic:blipFill>
+                    <a:blip r:embed="rId42"/>
+                    <a:stretch>
+                      <a:fillRect/>
+                    </a:stretch>
+                  </pic:blipFill>
+                  <pic:spPr>
+                    <a:xfrm>
+                      <a:off x="0" y="0"/>
+                      <a:ext cx="4344006" cy="219106"/>
+                    </a:xfrm>
+                    <a:prstGeom prst="rect">
+                      <a:avLst/>
+                    </a:prstGeom>
+                  </pic:spPr>
+                </pic:pic>
+              </a:graphicData>
+            </a:graphic>
+          </wp:inline>
+        </w:drawing>
       </w:r>
     </w:p>
     <w:p>
@@ -2787,15 +3243,116 @@
           <w:numId w:val="38"/>
         </w:numPr>
         <w:spacing w:before="0" w:after="160" w:line="259" w:lineRule="auto"/>
-      </w:pPr>
-      <w:r>
-        <w:t>Afficher la configuration actuelle d</w:t>
-      </w:r>
-      <w:r>
-        <w:t>u routeur</w:t>
-      </w:r>
-      <w:r>
-        <w:t xml:space="preserve"> et vérifier les configurations</w:t>
+        <w:rPr>
+          <w:rFonts w:ascii="Courier New" w:eastAsiaTheme="minorHAnsi" w:hAnsi="Courier New" w:cs="Courier New"/>
+          <w:noProof/>
+          <w:sz w:val="22"/>
+          <w:szCs w:val="22"/>
+        </w:rPr>
+      </w:pPr>
+      <w:r>
+        <w:t>Enregistrer la configuration du routeur</w:t>
+      </w:r>
+    </w:p>
+    <w:p>
+      <w:pPr>
+        <w:pStyle w:val="Paragraphedeliste"/>
+        <w:spacing w:before="0" w:after="160" w:line="259" w:lineRule="auto"/>
+        <w:ind w:left="1440"/>
+        <w:rPr>
+          <w:rStyle w:val="CodeChar"/>
+          <w:rFonts w:eastAsiaTheme="minorHAnsi"/>
+          <w:iCs w:val="0"/>
+          <w:sz w:val="22"/>
+          <w:szCs w:val="22"/>
+        </w:rPr>
+      </w:pPr>
+      <w:r>
+        <w:rPr>
+          <w:rStyle w:val="CodeChar"/>
+          <w:rFonts w:eastAsiaTheme="minorHAnsi"/>
+          <w:iCs w:val="0"/>
+          <w:sz w:val="22"/>
+          <w:szCs w:val="22"/>
+        </w:rPr>
+        <w:drawing>
+          <wp:anchor distT="0" distB="0" distL="114300" distR="114300" simplePos="0" relativeHeight="251658240" behindDoc="0" locked="0" layoutInCell="1" allowOverlap="1" wp14:anchorId="22FA76F9" wp14:editId="23CB9581">
+            <wp:simplePos x="1828800" y="8550322"/>
+            <wp:positionH relativeFrom="column">
+              <wp:align>left</wp:align>
+            </wp:positionH>
+            <wp:positionV relativeFrom="paragraph">
+              <wp:align>top</wp:align>
+            </wp:positionV>
+            <wp:extent cx="2572109" cy="200053"/>
+            <wp:effectExtent l="0" t="0" r="0" b="9525"/>
+            <wp:wrapSquare wrapText="bothSides"/>
+            <wp:docPr id="1498692583" name="Image 1"/>
+            <wp:cNvGraphicFramePr>
+              <a:graphicFrameLocks xmlns:a="http://schemas.openxmlformats.org/drawingml/2006/main" noChangeAspect="1"/>
+            </wp:cNvGraphicFramePr>
+            <a:graphic xmlns:a="http://schemas.openxmlformats.org/drawingml/2006/main">
+              <a:graphicData uri="http://schemas.openxmlformats.org/drawingml/2006/picture">
+                <pic:pic xmlns:pic="http://schemas.openxmlformats.org/drawingml/2006/picture">
+                  <pic:nvPicPr>
+                    <pic:cNvPr id="1498692583" name=""/>
+                    <pic:cNvPicPr/>
+                  </pic:nvPicPr>
+                  <pic:blipFill>
+                    <a:blip r:embed="rId43">
+                      <a:extLst>
+                        <a:ext uri="{28A0092B-C50C-407E-A947-70E740481C1C}">
+                          <a14:useLocalDpi xmlns:a14="http://schemas.microsoft.com/office/drawing/2010/main" val="0"/>
+                        </a:ext>
+                      </a:extLst>
+                    </a:blip>
+                    <a:stretch>
+                      <a:fillRect/>
+                    </a:stretch>
+                  </pic:blipFill>
+                  <pic:spPr>
+                    <a:xfrm>
+                      <a:off x="0" y="0"/>
+                      <a:ext cx="2572109" cy="200053"/>
+                    </a:xfrm>
+                    <a:prstGeom prst="rect">
+                      <a:avLst/>
+                    </a:prstGeom>
+                  </pic:spPr>
+                </pic:pic>
+              </a:graphicData>
+            </a:graphic>
+          </wp:anchor>
+        </w:drawing>
+      </w:r>
+      <w:r>
+        <w:rPr>
+          <w:rStyle w:val="CodeChar"/>
+          <w:rFonts w:eastAsiaTheme="minorHAnsi"/>
+          <w:iCs w:val="0"/>
+          <w:sz w:val="22"/>
+          <w:szCs w:val="22"/>
+        </w:rPr>
+        <w:br w:type="textWrapping" w:clear="all"/>
+      </w:r>
+    </w:p>
+    <w:p>
+      <w:pPr>
+        <w:pStyle w:val="Paragraphedeliste"/>
+        <w:numPr>
+          <w:ilvl w:val="0"/>
+          <w:numId w:val="38"/>
+        </w:numPr>
+        <w:spacing w:before="0" w:after="160" w:line="259" w:lineRule="auto"/>
+      </w:pPr>
+      <w:r>
+        <w:t xml:space="preserve">Configurer SSH </w:t>
+      </w:r>
+      <w:r>
+        <w:t xml:space="preserve">sur le routeur </w:t>
+      </w:r>
+      <w:r>
+        <w:t>avec la configuration suivante</w:t>
       </w:r>
     </w:p>
     <w:p>
@@ -2808,7 +3365,384 @@
         <w:spacing w:before="0" w:after="160" w:line="259" w:lineRule="auto"/>
       </w:pPr>
       <w:r>
+        <w:lastRenderedPageBreak/>
+        <w:t xml:space="preserve">Créer un compte </w:t>
+      </w:r>
+      <w:r>
+        <w:rPr>
+          <w:rStyle w:val="CodeCar"/>
+        </w:rPr>
+        <w:t>cstj</w:t>
+      </w:r>
+      <w:r>
+        <w:t xml:space="preserve"> avec un mot de passe sécuritaire</w:t>
+      </w:r>
+      <w:r>
+        <w:t xml:space="preserve"> différent</w:t>
+      </w:r>
+      <w:r>
+        <w:t xml:space="preserve"> de la Switch</w:t>
+      </w:r>
+    </w:p>
+    <w:p>
+      <w:pPr>
+        <w:pStyle w:val="Paragraphedeliste"/>
+        <w:spacing w:before="0" w:after="160" w:line="259" w:lineRule="auto"/>
+        <w:ind w:left="1440"/>
+      </w:pPr>
+      <w:r>
+        <w:drawing>
+          <wp:inline distT="0" distB="0" distL="0" distR="0" wp14:anchorId="084F8581" wp14:editId="6E446CEA">
+            <wp:extent cx="5943600" cy="180340"/>
+            <wp:effectExtent l="0" t="0" r="0" b="0"/>
+            <wp:docPr id="709345543" name="Image 1"/>
+            <wp:cNvGraphicFramePr>
+              <a:graphicFrameLocks xmlns:a="http://schemas.openxmlformats.org/drawingml/2006/main" noChangeAspect="1"/>
+            </wp:cNvGraphicFramePr>
+            <a:graphic xmlns:a="http://schemas.openxmlformats.org/drawingml/2006/main">
+              <a:graphicData uri="http://schemas.openxmlformats.org/drawingml/2006/picture">
+                <pic:pic xmlns:pic="http://schemas.openxmlformats.org/drawingml/2006/picture">
+                  <pic:nvPicPr>
+                    <pic:cNvPr id="709345543" name=""/>
+                    <pic:cNvPicPr/>
+                  </pic:nvPicPr>
+                  <pic:blipFill>
+                    <a:blip r:embed="rId44"/>
+                    <a:stretch>
+                      <a:fillRect/>
+                    </a:stretch>
+                  </pic:blipFill>
+                  <pic:spPr>
+                    <a:xfrm>
+                      <a:off x="0" y="0"/>
+                      <a:ext cx="5943600" cy="180340"/>
+                    </a:xfrm>
+                    <a:prstGeom prst="rect">
+                      <a:avLst/>
+                    </a:prstGeom>
+                  </pic:spPr>
+                </pic:pic>
+              </a:graphicData>
+            </a:graphic>
+          </wp:inline>
+        </w:drawing>
+      </w:r>
+      <w:r>
+        <w:drawing>
+          <wp:inline distT="0" distB="0" distL="0" distR="0" wp14:anchorId="20DF777F" wp14:editId="37F7FC3C">
+            <wp:extent cx="5572903" cy="238158"/>
+            <wp:effectExtent l="0" t="0" r="8890" b="9525"/>
+            <wp:docPr id="1775306166" name="Image 1"/>
+            <wp:cNvGraphicFramePr>
+              <a:graphicFrameLocks xmlns:a="http://schemas.openxmlformats.org/drawingml/2006/main" noChangeAspect="1"/>
+            </wp:cNvGraphicFramePr>
+            <a:graphic xmlns:a="http://schemas.openxmlformats.org/drawingml/2006/main">
+              <a:graphicData uri="http://schemas.openxmlformats.org/drawingml/2006/picture">
+                <pic:pic xmlns:pic="http://schemas.openxmlformats.org/drawingml/2006/picture">
+                  <pic:nvPicPr>
+                    <pic:cNvPr id="1775306166" name=""/>
+                    <pic:cNvPicPr/>
+                  </pic:nvPicPr>
+                  <pic:blipFill>
+                    <a:blip r:embed="rId45"/>
+                    <a:stretch>
+                      <a:fillRect/>
+                    </a:stretch>
+                  </pic:blipFill>
+                  <pic:spPr>
+                    <a:xfrm>
+                      <a:off x="0" y="0"/>
+                      <a:ext cx="5572903" cy="238158"/>
+                    </a:xfrm>
+                    <a:prstGeom prst="rect">
+                      <a:avLst/>
+                    </a:prstGeom>
+                  </pic:spPr>
+                </pic:pic>
+              </a:graphicData>
+            </a:graphic>
+          </wp:inline>
+        </w:drawing>
+      </w:r>
+    </w:p>
+    <w:p>
+      <w:pPr>
+        <w:pStyle w:val="Paragraphedeliste"/>
+        <w:numPr>
+          <w:ilvl w:val="1"/>
+          <w:numId w:val="38"/>
+        </w:numPr>
+        <w:spacing w:before="0" w:after="160" w:line="259" w:lineRule="auto"/>
+        <w:rPr>
+          <w:rStyle w:val="CodeCar"/>
+          <w:rFonts w:asciiTheme="minorHAnsi" w:eastAsiaTheme="minorEastAsia" w:hAnsiTheme="minorHAnsi"/>
+          <w:noProof w:val="0"/>
+          <w:sz w:val="20"/>
+          <w:szCs w:val="20"/>
+        </w:rPr>
+      </w:pPr>
+      <w:r>
+        <w:t xml:space="preserve">Nommer le routeur </w:t>
+      </w:r>
+      <w:r>
+        <w:rPr>
+          <w:rStyle w:val="CodeCar"/>
+        </w:rPr>
+        <w:t>router</w:t>
+      </w:r>
+      <w:r>
+        <w:rPr>
+          <w:rStyle w:val="CodeCar"/>
+        </w:rPr>
+        <w:t>-</w:t>
+      </w:r>
+      <w:r>
+        <w:rPr>
+          <w:rStyle w:val="CodeCar"/>
+        </w:rPr>
+        <w:t>d138</w:t>
+      </w:r>
+    </w:p>
+    <w:p>
+      <w:pPr>
+        <w:pStyle w:val="Paragraphedeliste"/>
+        <w:spacing w:before="0" w:after="160" w:line="259" w:lineRule="auto"/>
+        <w:ind w:left="1440"/>
+      </w:pPr>
+      <w:r>
+        <w:drawing>
+          <wp:inline distT="0" distB="0" distL="0" distR="0" wp14:anchorId="1CD5CD33" wp14:editId="512DDEA4">
+            <wp:extent cx="3943900" cy="266737"/>
+            <wp:effectExtent l="0" t="0" r="0" b="0"/>
+            <wp:docPr id="544284355" name="Image 1"/>
+            <wp:cNvGraphicFramePr>
+              <a:graphicFrameLocks xmlns:a="http://schemas.openxmlformats.org/drawingml/2006/main" noChangeAspect="1"/>
+            </wp:cNvGraphicFramePr>
+            <a:graphic xmlns:a="http://schemas.openxmlformats.org/drawingml/2006/main">
+              <a:graphicData uri="http://schemas.openxmlformats.org/drawingml/2006/picture">
+                <pic:pic xmlns:pic="http://schemas.openxmlformats.org/drawingml/2006/picture">
+                  <pic:nvPicPr>
+                    <pic:cNvPr id="544284355" name=""/>
+                    <pic:cNvPicPr/>
+                  </pic:nvPicPr>
+                  <pic:blipFill>
+                    <a:blip r:embed="rId46"/>
+                    <a:stretch>
+                      <a:fillRect/>
+                    </a:stretch>
+                  </pic:blipFill>
+                  <pic:spPr>
+                    <a:xfrm>
+                      <a:off x="0" y="0"/>
+                      <a:ext cx="3943900" cy="266737"/>
+                    </a:xfrm>
+                    <a:prstGeom prst="rect">
+                      <a:avLst/>
+                    </a:prstGeom>
+                  </pic:spPr>
+                </pic:pic>
+              </a:graphicData>
+            </a:graphic>
+          </wp:inline>
+        </w:drawing>
+      </w:r>
+    </w:p>
+    <w:p>
+      <w:pPr>
+        <w:pStyle w:val="Paragraphedeliste"/>
+        <w:numPr>
+          <w:ilvl w:val="1"/>
+          <w:numId w:val="38"/>
+        </w:numPr>
+        <w:spacing w:before="0" w:after="160" w:line="259" w:lineRule="auto"/>
+      </w:pPr>
+      <w:r>
+        <w:t xml:space="preserve">Configurer SSH avec un certificat d’encryption pour le domaine </w:t>
+      </w:r>
+      <w:r>
+        <w:rPr>
+          <w:rStyle w:val="CodeCar"/>
+        </w:rPr>
+        <w:t>cstj.qc.ca</w:t>
+      </w:r>
+      <w:r>
+        <w:t xml:space="preserve"> de </w:t>
+      </w:r>
+      <w:r>
+        <w:rPr>
+          <w:rStyle w:val="CodeCar"/>
+        </w:rPr>
+        <w:t>4096</w:t>
+      </w:r>
+      <w:r>
+        <w:t xml:space="preserve"> bi</w:t>
+      </w:r>
+      <w:r>
+        <w:t>ts</w:t>
+      </w:r>
+    </w:p>
+    <w:p>
+      <w:pPr>
+        <w:pStyle w:val="Paragraphedeliste"/>
+        <w:spacing w:before="0" w:after="160" w:line="259" w:lineRule="auto"/>
+        <w:ind w:left="1440"/>
+      </w:pPr>
+      <w:r>
+        <w:drawing>
+          <wp:inline distT="0" distB="0" distL="0" distR="0" wp14:anchorId="20EB56A6" wp14:editId="7F67D0BA">
+            <wp:extent cx="5001323" cy="209579"/>
+            <wp:effectExtent l="0" t="0" r="8890" b="0"/>
+            <wp:docPr id="1083486629" name="Image 1"/>
+            <wp:cNvGraphicFramePr>
+              <a:graphicFrameLocks xmlns:a="http://schemas.openxmlformats.org/drawingml/2006/main" noChangeAspect="1"/>
+            </wp:cNvGraphicFramePr>
+            <a:graphic xmlns:a="http://schemas.openxmlformats.org/drawingml/2006/main">
+              <a:graphicData uri="http://schemas.openxmlformats.org/drawingml/2006/picture">
+                <pic:pic xmlns:pic="http://schemas.openxmlformats.org/drawingml/2006/picture">
+                  <pic:nvPicPr>
+                    <pic:cNvPr id="1083486629" name=""/>
+                    <pic:cNvPicPr/>
+                  </pic:nvPicPr>
+                  <pic:blipFill>
+                    <a:blip r:embed="rId47"/>
+                    <a:stretch>
+                      <a:fillRect/>
+                    </a:stretch>
+                  </pic:blipFill>
+                  <pic:spPr>
+                    <a:xfrm>
+                      <a:off x="0" y="0"/>
+                      <a:ext cx="5001323" cy="209579"/>
+                    </a:xfrm>
+                    <a:prstGeom prst="rect">
+                      <a:avLst/>
+                    </a:prstGeom>
+                  </pic:spPr>
+                </pic:pic>
+              </a:graphicData>
+            </a:graphic>
+          </wp:inline>
+        </w:drawing>
+      </w:r>
+    </w:p>
+    <w:p>
+      <w:pPr>
+        <w:pStyle w:val="Paragraphedeliste"/>
+        <w:numPr>
+          <w:ilvl w:val="1"/>
+          <w:numId w:val="38"/>
+        </w:numPr>
+        <w:spacing w:before="0" w:after="160" w:line="259" w:lineRule="auto"/>
+      </w:pPr>
+      <w:r>
+        <w:t>Afficher la configuration actuelle d</w:t>
+      </w:r>
+      <w:r>
+        <w:t>u routeur</w:t>
+      </w:r>
+      <w:r>
+        <w:t xml:space="preserve"> et vérifier les configurations</w:t>
+      </w:r>
+    </w:p>
+    <w:p>
+      <w:pPr>
+        <w:pStyle w:val="Paragraphedeliste"/>
+        <w:spacing w:before="0" w:after="160" w:line="259" w:lineRule="auto"/>
+        <w:ind w:left="1440"/>
+      </w:pPr>
+      <w:r>
+        <w:drawing>
+          <wp:inline distT="0" distB="0" distL="0" distR="0" wp14:anchorId="2087420F" wp14:editId="5C8F0806">
+            <wp:extent cx="5943600" cy="197485"/>
+            <wp:effectExtent l="0" t="0" r="0" b="0"/>
+            <wp:docPr id="838597698" name="Image 1"/>
+            <wp:cNvGraphicFramePr>
+              <a:graphicFrameLocks xmlns:a="http://schemas.openxmlformats.org/drawingml/2006/main" noChangeAspect="1"/>
+            </wp:cNvGraphicFramePr>
+            <a:graphic xmlns:a="http://schemas.openxmlformats.org/drawingml/2006/main">
+              <a:graphicData uri="http://schemas.openxmlformats.org/drawingml/2006/picture">
+                <pic:pic xmlns:pic="http://schemas.openxmlformats.org/drawingml/2006/picture">
+                  <pic:nvPicPr>
+                    <pic:cNvPr id="838597698" name=""/>
+                    <pic:cNvPicPr/>
+                  </pic:nvPicPr>
+                  <pic:blipFill>
+                    <a:blip r:embed="rId48"/>
+                    <a:stretch>
+                      <a:fillRect/>
+                    </a:stretch>
+                  </pic:blipFill>
+                  <pic:spPr>
+                    <a:xfrm>
+                      <a:off x="0" y="0"/>
+                      <a:ext cx="5943600" cy="197485"/>
+                    </a:xfrm>
+                    <a:prstGeom prst="rect">
+                      <a:avLst/>
+                    </a:prstGeom>
+                  </pic:spPr>
+                </pic:pic>
+              </a:graphicData>
+            </a:graphic>
+          </wp:inline>
+        </w:drawing>
+      </w:r>
+    </w:p>
+    <w:p>
+      <w:pPr>
+        <w:pStyle w:val="Paragraphedeliste"/>
+        <w:numPr>
+          <w:ilvl w:val="1"/>
+          <w:numId w:val="38"/>
+        </w:numPr>
+        <w:spacing w:before="0" w:after="160" w:line="259" w:lineRule="auto"/>
+      </w:pPr>
+      <w:r>
         <w:t>Sauvegarder la configuration</w:t>
+      </w:r>
+    </w:p>
+    <w:p>
+      <w:pPr>
+        <w:pStyle w:val="Paragraphedeliste"/>
+        <w:spacing w:before="0" w:after="160" w:line="259" w:lineRule="auto"/>
+        <w:ind w:left="1440"/>
+      </w:pPr>
+      <w:r>
+        <w:drawing>
+          <wp:inline distT="0" distB="0" distL="0" distR="0" wp14:anchorId="54B18BB1" wp14:editId="3A48E1D7">
+            <wp:extent cx="3057952" cy="247685"/>
+            <wp:effectExtent l="0" t="0" r="0" b="0"/>
+            <wp:docPr id="1465902972" name="Image 1"/>
+            <wp:cNvGraphicFramePr>
+              <a:graphicFrameLocks xmlns:a="http://schemas.openxmlformats.org/drawingml/2006/main" noChangeAspect="1"/>
+            </wp:cNvGraphicFramePr>
+            <a:graphic xmlns:a="http://schemas.openxmlformats.org/drawingml/2006/main">
+              <a:graphicData uri="http://schemas.openxmlformats.org/drawingml/2006/picture">
+                <pic:pic xmlns:pic="http://schemas.openxmlformats.org/drawingml/2006/picture">
+                  <pic:nvPicPr>
+                    <pic:cNvPr id="1465902972" name=""/>
+                    <pic:cNvPicPr/>
+                  </pic:nvPicPr>
+                  <pic:blipFill>
+                    <a:blip r:embed="rId49"/>
+                    <a:stretch>
+                      <a:fillRect/>
+                    </a:stretch>
+                  </pic:blipFill>
+                  <pic:spPr>
+                    <a:xfrm>
+                      <a:off x="0" y="0"/>
+                      <a:ext cx="3057952" cy="247685"/>
+                    </a:xfrm>
+                    <a:prstGeom prst="rect">
+                      <a:avLst/>
+                    </a:prstGeom>
+                  </pic:spPr>
+                </pic:pic>
+              </a:graphicData>
+            </a:graphic>
+          </wp:inline>
+        </w:drawing>
       </w:r>
     </w:p>
     <w:p>
@@ -2944,6 +3878,64 @@
     <w:p>
       <w:pPr>
         <w:pStyle w:val="Paragraphedeliste"/>
+        <w:spacing w:before="0" w:after="160" w:line="259" w:lineRule="auto"/>
+        <w:ind w:left="2160"/>
+        <w:rPr>
+          <w:rStyle w:val="CodeCar"/>
+          <w:rFonts w:asciiTheme="minorHAnsi" w:eastAsiaTheme="minorEastAsia" w:hAnsiTheme="minorHAnsi"/>
+          <w:noProof w:val="0"/>
+          <w:sz w:val="20"/>
+          <w:szCs w:val="20"/>
+        </w:rPr>
+      </w:pPr>
+      <w:r>
+        <w:rPr>
+          <w:rStyle w:val="CodeCar"/>
+          <w:rFonts w:asciiTheme="minorHAnsi" w:eastAsiaTheme="minorEastAsia" w:hAnsiTheme="minorHAnsi"/>
+          <w:noProof w:val="0"/>
+          <w:sz w:val="20"/>
+          <w:szCs w:val="20"/>
+        </w:rPr>
+        <w:drawing>
+          <wp:inline distT="0" distB="0" distL="0" distR="0" wp14:anchorId="7ABEF60E" wp14:editId="64CF2636">
+            <wp:extent cx="5943600" cy="2645410"/>
+            <wp:effectExtent l="0" t="0" r="0" b="2540"/>
+            <wp:docPr id="626587118" name="Image 1"/>
+            <wp:cNvGraphicFramePr>
+              <a:graphicFrameLocks xmlns:a="http://schemas.openxmlformats.org/drawingml/2006/main" noChangeAspect="1"/>
+            </wp:cNvGraphicFramePr>
+            <a:graphic xmlns:a="http://schemas.openxmlformats.org/drawingml/2006/main">
+              <a:graphicData uri="http://schemas.openxmlformats.org/drawingml/2006/picture">
+                <pic:pic xmlns:pic="http://schemas.openxmlformats.org/drawingml/2006/picture">
+                  <pic:nvPicPr>
+                    <pic:cNvPr id="626587118" name=""/>
+                    <pic:cNvPicPr/>
+                  </pic:nvPicPr>
+                  <pic:blipFill>
+                    <a:blip r:embed="rId50"/>
+                    <a:stretch>
+                      <a:fillRect/>
+                    </a:stretch>
+                  </pic:blipFill>
+                  <pic:spPr>
+                    <a:xfrm>
+                      <a:off x="0" y="0"/>
+                      <a:ext cx="5943600" cy="2645410"/>
+                    </a:xfrm>
+                    <a:prstGeom prst="rect">
+                      <a:avLst/>
+                    </a:prstGeom>
+                  </pic:spPr>
+                </pic:pic>
+              </a:graphicData>
+            </a:graphic>
+          </wp:inline>
+        </w:drawing>
+      </w:r>
+    </w:p>
+    <w:p>
+      <w:pPr>
+        <w:pStyle w:val="Paragraphedeliste"/>
         <w:numPr>
           <w:ilvl w:val="2"/>
           <w:numId w:val="38"/>
@@ -2987,13 +3979,69 @@
     <w:p>
       <w:pPr>
         <w:pStyle w:val="Paragraphedeliste"/>
+        <w:spacing w:before="0" w:after="160" w:line="259" w:lineRule="auto"/>
+        <w:ind w:left="2160"/>
+        <w:rPr>
+          <w:rStyle w:val="CodeCar"/>
+          <w:rFonts w:asciiTheme="minorHAnsi" w:eastAsiaTheme="minorEastAsia" w:hAnsiTheme="minorHAnsi"/>
+          <w:noProof w:val="0"/>
+          <w:sz w:val="20"/>
+          <w:szCs w:val="20"/>
+        </w:rPr>
+      </w:pPr>
+      <w:r>
+        <w:rPr>
+          <w:rStyle w:val="CodeCar"/>
+          <w:rFonts w:asciiTheme="minorHAnsi" w:eastAsiaTheme="minorEastAsia" w:hAnsiTheme="minorHAnsi"/>
+          <w:noProof w:val="0"/>
+          <w:sz w:val="20"/>
+          <w:szCs w:val="20"/>
+        </w:rPr>
+        <w:drawing>
+          <wp:inline distT="0" distB="0" distL="0" distR="0" wp14:anchorId="4FEA6062" wp14:editId="6D806DDC">
+            <wp:extent cx="5715798" cy="1476581"/>
+            <wp:effectExtent l="0" t="0" r="0" b="9525"/>
+            <wp:docPr id="37430423" name="Image 1"/>
+            <wp:cNvGraphicFramePr>
+              <a:graphicFrameLocks xmlns:a="http://schemas.openxmlformats.org/drawingml/2006/main" noChangeAspect="1"/>
+            </wp:cNvGraphicFramePr>
+            <a:graphic xmlns:a="http://schemas.openxmlformats.org/drawingml/2006/main">
+              <a:graphicData uri="http://schemas.openxmlformats.org/drawingml/2006/picture">
+                <pic:pic xmlns:pic="http://schemas.openxmlformats.org/drawingml/2006/picture">
+                  <pic:nvPicPr>
+                    <pic:cNvPr id="37430423" name=""/>
+                    <pic:cNvPicPr/>
+                  </pic:nvPicPr>
+                  <pic:blipFill>
+                    <a:blip r:embed="rId51"/>
+                    <a:stretch>
+                      <a:fillRect/>
+                    </a:stretch>
+                  </pic:blipFill>
+                  <pic:spPr>
+                    <a:xfrm>
+                      <a:off x="0" y="0"/>
+                      <a:ext cx="5715798" cy="1476581"/>
+                    </a:xfrm>
+                    <a:prstGeom prst="rect">
+                      <a:avLst/>
+                    </a:prstGeom>
+                  </pic:spPr>
+                </pic:pic>
+              </a:graphicData>
+            </a:graphic>
+          </wp:inline>
+        </w:drawing>
+      </w:r>
+    </w:p>
+    <w:p>
+      <w:pPr>
+        <w:pStyle w:val="Paragraphedeliste"/>
         <w:numPr>
           <w:ilvl w:val="3"/>
           <w:numId w:val="38"/>
         </w:numPr>
         <w:spacing w:before="0" w:after="160" w:line="259" w:lineRule="auto"/>
-      </w:pPr>
-      <w:r>
         <w:rPr>
           <w:rStyle w:val="CodeCar"/>
           <w:rFonts w:asciiTheme="minorHAnsi" w:eastAsiaTheme="minorEastAsia" w:hAnsiTheme="minorHAnsi"/>
@@ -3001,14 +4049,89 @@
           <w:sz w:val="20"/>
           <w:szCs w:val="20"/>
         </w:rPr>
+      </w:pPr>
+      <w:r>
+        <w:rPr>
+          <w:rStyle w:val="CodeCar"/>
+          <w:rFonts w:asciiTheme="minorHAnsi" w:eastAsiaTheme="minorEastAsia" w:hAnsiTheme="minorHAnsi"/>
+          <w:noProof w:val="0"/>
+          <w:sz w:val="20"/>
+          <w:szCs w:val="20"/>
+        </w:rPr>
         <w:t>Vérifier que le PC peut aller en mode privilégié et sauvegarder la configuration</w:t>
       </w:r>
     </w:p>
     <w:p>
       <w:pPr>
+        <w:pStyle w:val="Paragraphedeliste"/>
+        <w:spacing w:before="0" w:after="160" w:line="259" w:lineRule="auto"/>
+        <w:ind w:left="2880"/>
+        <w:rPr>
+          <w:rStyle w:val="CodeCar"/>
+          <w:rFonts w:asciiTheme="minorHAnsi" w:eastAsiaTheme="minorEastAsia" w:hAnsiTheme="minorHAnsi"/>
+          <w:noProof w:val="0"/>
+          <w:sz w:val="20"/>
+          <w:szCs w:val="20"/>
+        </w:rPr>
+      </w:pPr>
+      <w:r>
+        <w:rPr>
+          <w:rStyle w:val="CodeCar"/>
+          <w:rFonts w:asciiTheme="minorHAnsi" w:eastAsiaTheme="minorEastAsia" w:hAnsiTheme="minorHAnsi"/>
+          <w:noProof w:val="0"/>
+          <w:sz w:val="20"/>
+          <w:szCs w:val="20"/>
+        </w:rPr>
+        <w:drawing>
+          <wp:inline distT="0" distB="0" distL="0" distR="0" wp14:anchorId="516DE3E0" wp14:editId="7FCBFB3D">
+            <wp:extent cx="3248478" cy="590632"/>
+            <wp:effectExtent l="0" t="0" r="9525" b="0"/>
+            <wp:docPr id="1345183142" name="Image 1"/>
+            <wp:cNvGraphicFramePr>
+              <a:graphicFrameLocks xmlns:a="http://schemas.openxmlformats.org/drawingml/2006/main" noChangeAspect="1"/>
+            </wp:cNvGraphicFramePr>
+            <a:graphic xmlns:a="http://schemas.openxmlformats.org/drawingml/2006/main">
+              <a:graphicData uri="http://schemas.openxmlformats.org/drawingml/2006/picture">
+                <pic:pic xmlns:pic="http://schemas.openxmlformats.org/drawingml/2006/picture">
+                  <pic:nvPicPr>
+                    <pic:cNvPr id="1345183142" name=""/>
+                    <pic:cNvPicPr/>
+                  </pic:nvPicPr>
+                  <pic:blipFill>
+                    <a:blip r:embed="rId52"/>
+                    <a:stretch>
+                      <a:fillRect/>
+                    </a:stretch>
+                  </pic:blipFill>
+                  <pic:spPr>
+                    <a:xfrm>
+                      <a:off x="0" y="0"/>
+                      <a:ext cx="3248478" cy="590632"/>
+                    </a:xfrm>
+                    <a:prstGeom prst="rect">
+                      <a:avLst/>
+                    </a:prstGeom>
+                  </pic:spPr>
+                </pic:pic>
+              </a:graphicData>
+            </a:graphic>
+          </wp:inline>
+        </w:drawing>
+      </w:r>
+    </w:p>
+    <w:p>
+      <w:pPr>
+        <w:pStyle w:val="Paragraphedeliste"/>
+        <w:spacing w:before="0" w:after="160" w:line="259" w:lineRule="auto"/>
+        <w:ind w:left="2880"/>
+      </w:pPr>
+    </w:p>
+    <w:p>
+      <w:pPr>
         <w:pStyle w:val="Titre3"/>
       </w:pPr>
       <w:r>
+        <w:lastRenderedPageBreak/>
         <w:t xml:space="preserve">Exports des </w:t>
       </w:r>
       <w:r>
@@ -3245,12 +4368,12 @@
       </w:r>
     </w:p>
     <w:sectPr>
-      <w:headerReference w:type="even" r:id="rId32"/>
-      <w:headerReference w:type="default" r:id="rId33"/>
-      <w:footerReference w:type="even" r:id="rId34"/>
-      <w:footerReference w:type="default" r:id="rId35"/>
-      <w:headerReference w:type="first" r:id="rId36"/>
-      <w:footerReference w:type="first" r:id="rId37"/>
+      <w:headerReference w:type="even" r:id="rId53"/>
+      <w:headerReference w:type="default" r:id="rId54"/>
+      <w:footerReference w:type="even" r:id="rId55"/>
+      <w:footerReference w:type="default" r:id="rId56"/>
+      <w:headerReference w:type="first" r:id="rId57"/>
+      <w:footerReference w:type="first" r:id="rId58"/>
       <w:pgSz w:w="12240" w:h="15840"/>
       <w:pgMar w:top="1440" w:right="1440" w:bottom="1440" w:left="1440" w:header="720" w:footer="720" w:gutter="0"/>
       <w:cols w:space="720"/>
@@ -8100,10 +9223,6 @@
 </file>
 
 <file path=customXml/item1.xml><?xml version="1.0" encoding="utf-8"?>
-<b:Sources xmlns:b="http://schemas.openxmlformats.org/officeDocument/2006/bibliography" xmlns="http://schemas.openxmlformats.org/officeDocument/2006/bibliography" SelectedStyle="\APASixthEditionOfficeOnline.xsl" StyleName="APA" Version="6"/>
-</file>
-
-<file path=customXml/item2.xml><?xml version="1.0" encoding="utf-8"?>
 <ct:contentTypeSchema xmlns:ct="http://schemas.microsoft.com/office/2006/metadata/contentType" xmlns:ma="http://schemas.microsoft.com/office/2006/metadata/properties/metaAttributes" ct:_="" ma:_="" ma:contentTypeName="Document" ma:contentTypeID="0x010100B6EB6CCE8CCD4E4DB985DB752124FB64" ma:contentTypeVersion="10" ma:contentTypeDescription="Crée un document." ma:contentTypeScope="" ma:versionID="b659a35cc065ce33eb26c369abf814fa">
   <xsd:schema xmlns:xsd="http://www.w3.org/2001/XMLSchema" xmlns:xs="http://www.w3.org/2001/XMLSchema" xmlns:p="http://schemas.microsoft.com/office/2006/metadata/properties" xmlns:ns2="3c67b34e-3a70-4c82-a88a-c9ff4020302e" xmlns:ns3="b34e80cf-1934-4719-b55f-e2e975c926d7" targetNamespace="http://schemas.microsoft.com/office/2006/metadata/properties" ma:root="true" ma:fieldsID="c93dd5925414f1ca5912f8992d0a2fab" ns2:_="" ns3:_="">
     <xsd:import namespace="3c67b34e-3a70-4c82-a88a-c9ff4020302e"/>
@@ -8292,16 +9411,11 @@
 </ct:contentTypeSchema>
 </file>
 
-<file path=customXml/item3.xml><?xml version="1.0" encoding="utf-8"?>
-<?mso-contentType ?>
-<FormTemplates xmlns="http://schemas.microsoft.com/sharepoint/v3/contenttype/forms">
-  <Display>DocumentLibraryForm</Display>
-  <Edit>DocumentLibraryForm</Edit>
-  <New>DocumentLibraryForm</New>
-</FormTemplates>
+<file path=customXml/item2.xml><?xml version="1.0" encoding="utf-8"?>
+<b:Sources xmlns:b="http://schemas.openxmlformats.org/officeDocument/2006/bibliography" xmlns="http://schemas.openxmlformats.org/officeDocument/2006/bibliography" SelectedStyle="\APASixthEditionOfficeOnline.xsl" StyleName="APA" Version="6"/>
 </file>
 
-<file path=customXml/item4.xml><?xml version="1.0" encoding="utf-8"?>
+<file path=customXml/item3.xml><?xml version="1.0" encoding="utf-8"?>
 <p:properties xmlns:p="http://schemas.microsoft.com/office/2006/metadata/properties" xmlns:xsi="http://www.w3.org/2001/XMLSchema-instance" xmlns:pc="http://schemas.microsoft.com/office/infopath/2007/PartnerControls">
   <documentManagement>
     <lcf76f155ced4ddcb4097134ff3c332f xmlns="3c67b34e-3a70-4c82-a88a-c9ff4020302e">
@@ -8312,15 +9426,16 @@
 </p:properties>
 </file>
 
-<file path=customXml/itemProps1.xml><?xml version="1.0" encoding="utf-8"?>
-<ds:datastoreItem xmlns:ds="http://schemas.openxmlformats.org/officeDocument/2006/customXml" ds:itemID="{20730C14-5559-4816-8D2F-267CB32F4239}">
-  <ds:schemaRefs>
-    <ds:schemaRef ds:uri="http://schemas.openxmlformats.org/officeDocument/2006/bibliography"/>
-  </ds:schemaRefs>
-</ds:datastoreItem>
+<file path=customXml/item4.xml><?xml version="1.0" encoding="utf-8"?>
+<?mso-contentType ?>
+<FormTemplates xmlns="http://schemas.microsoft.com/sharepoint/v3/contenttype/forms">
+  <Display>DocumentLibraryForm</Display>
+  <Edit>DocumentLibraryForm</Edit>
+  <New>DocumentLibraryForm</New>
+</FormTemplates>
 </file>
 
-<file path=customXml/itemProps2.xml><?xml version="1.0" encoding="utf-8"?>
+<file path=customXml/itemProps1.xml><?xml version="1.0" encoding="utf-8"?>
 <ds:datastoreItem xmlns:ds="http://schemas.openxmlformats.org/officeDocument/2006/customXml" ds:itemID="{F118890F-FC38-4984-9862-DA8F8EE43799}">
   <ds:schemaRefs>
     <ds:schemaRef ds:uri="http://schemas.microsoft.com/office/2006/metadata/contentType"/>
@@ -8339,15 +9454,15 @@
 </ds:datastoreItem>
 </file>
 
-<file path=customXml/itemProps3.xml><?xml version="1.0" encoding="utf-8"?>
-<ds:datastoreItem xmlns:ds="http://schemas.openxmlformats.org/officeDocument/2006/customXml" ds:itemID="{5991A026-0A3A-4A40-9DFB-B1FAB829B1E8}">
+<file path=customXml/itemProps2.xml><?xml version="1.0" encoding="utf-8"?>
+<ds:datastoreItem xmlns:ds="http://schemas.openxmlformats.org/officeDocument/2006/customXml" ds:itemID="{20730C14-5559-4816-8D2F-267CB32F4239}">
   <ds:schemaRefs>
-    <ds:schemaRef ds:uri="http://schemas.microsoft.com/sharepoint/v3/contenttype/forms"/>
+    <ds:schemaRef ds:uri="http://schemas.openxmlformats.org/officeDocument/2006/bibliography"/>
   </ds:schemaRefs>
 </ds:datastoreItem>
 </file>
 
-<file path=customXml/itemProps4.xml><?xml version="1.0" encoding="utf-8"?>
+<file path=customXml/itemProps3.xml><?xml version="1.0" encoding="utf-8"?>
 <ds:datastoreItem xmlns:ds="http://schemas.openxmlformats.org/officeDocument/2006/customXml" ds:itemID="{B1A0529D-107D-48F2-9C7A-C9B0532E61D6}">
   <ds:schemaRefs>
     <ds:schemaRef ds:uri="http://schemas.microsoft.com/office/2006/metadata/properties"/>
@@ -8356,4 +9471,12 @@
     <ds:schemaRef ds:uri="b34e80cf-1934-4719-b55f-e2e975c926d7"/>
   </ds:schemaRefs>
 </ds:datastoreItem>
+</file>
+
+<file path=customXml/itemProps4.xml><?xml version="1.0" encoding="utf-8"?>
+<ds:datastoreItem xmlns:ds="http://schemas.openxmlformats.org/officeDocument/2006/customXml" ds:itemID="{5991A026-0A3A-4A40-9DFB-B1FAB829B1E8}">
+  <ds:schemaRefs>
+    <ds:schemaRef ds:uri="http://schemas.microsoft.com/sharepoint/v3/contenttype/forms"/>
+  </ds:schemaRefs>
+</ds:datastoreItem>
 </file>
</xml_diff>